<commit_message>
version 1 del dashboard
</commit_message>
<xml_diff>
--- a/instance_evidence/Evidencia de las conexiones.docx
+++ b/instance_evidence/Evidencia de las conexiones.docx
@@ -3,112 +3,63 @@
 <w:document xmlns:wpc="http://schemas.microsoft.com/office/word/2010/wordprocessingCanvas" xmlns:cx="http://schemas.microsoft.com/office/drawing/2014/chartex" xmlns:cx1="http://schemas.microsoft.com/office/drawing/2015/9/8/chartex" xmlns:cx2="http://schemas.microsoft.com/office/drawing/2015/10/21/chartex" xmlns:cx3="http://schemas.microsoft.com/office/drawing/2016/5/9/chartex" xmlns:cx4="http://schemas.microsoft.com/office/drawing/2016/5/10/chartex" xmlns:cx5="http://schemas.microsoft.com/office/drawing/2016/5/11/chartex" xmlns:cx6="http://schemas.microsoft.com/office/drawing/2016/5/12/chartex" xmlns:cx7="http://schemas.microsoft.com/office/drawing/2016/5/13/chartex" xmlns:cx8="http://schemas.microsoft.com/office/drawing/2016/5/14/chartex" xmlns:mc="http://schemas.openxmlformats.org/markup-compatibility/2006" xmlns:aink="http://schemas.microsoft.com/office/drawing/2016/ink" xmlns:am3d="http://schemas.microsoft.com/office/drawing/2017/model3d" xmlns:o="urn:schemas-microsoft-com:office:office" xmlns:r="http://schemas.openxmlformats.org/officeDocument/2006/relationships" xmlns:m="http://schemas.openxmlformats.org/officeDocument/2006/math" xmlns:v="urn:schemas-microsoft-com:vml" xmlns:wp14="http://schemas.microsoft.com/office/word/2010/wordprocessingDrawing" xmlns:wp="http://schemas.openxmlformats.org/drawingml/2006/wordprocessingDrawing" xmlns:w10="urn:schemas-microsoft-com:office:word" xmlns:w="http://schemas.openxmlformats.org/wordprocessingml/2006/main" xmlns:w14="http://schemas.microsoft.com/office/word/2010/wordml" xmlns:w15="http://schemas.microsoft.com/office/word/2012/wordml" xmlns:w16cex="http://schemas.microsoft.com/office/word/2018/wordml/cex" xmlns:w16cid="http://schemas.microsoft.com/office/word/2016/wordml/cid" xmlns:w16="http://schemas.microsoft.com/office/word/2018/wordml" xmlns:w16se="http://schemas.microsoft.com/office/word/2015/wordml/symex" xmlns:wpg="http://schemas.microsoft.com/office/word/2010/wordprocessingGroup" xmlns:wpi="http://schemas.microsoft.com/office/word/2010/wordprocessingInk" xmlns:wne="http://schemas.microsoft.com/office/word/2006/wordml" xmlns:wps="http://schemas.microsoft.com/office/word/2010/wordprocessingShape" mc:Ignorable="w14 w15 w16se w16cid w16 w16cex wp14">
   <w:body>
     <w:p>
-      <w:proofErr w:type="spellStart"/>
-      <w:r>
-        <w:t>Evidencia</w:t>
-      </w:r>
-      <w:proofErr w:type="spellEnd"/>
-      <w:r>
-        <w:t xml:space="preserve"> de las </w:t>
-      </w:r>
-      <w:proofErr w:type="spellStart"/>
-      <w:r>
-        <w:t>conexiones</w:t>
-      </w:r>
-      <w:proofErr w:type="spellEnd"/>
-      <w:r>
+      <w:pPr>
+        <w:jc w:val="both"/>
+        <w:rPr>
+          <w:lang w:val="es-ES"/>
+        </w:rPr>
+      </w:pPr>
+      <w:r>
+        <w:rPr>
+          <w:lang w:val="es-ES"/>
+        </w:rPr>
+        <w:t>Evidencia de las conexiones</w:t>
+      </w:r>
+      <w:r>
+        <w:rPr>
+          <w:lang w:val="es-ES"/>
+        </w:rPr>
         <w:t>:</w:t>
       </w:r>
     </w:p>
-    <w:p/>
-    <w:p>
-      <w:proofErr w:type="spellStart"/>
-      <w:r>
-        <w:t>Creación</w:t>
-      </w:r>
-      <w:proofErr w:type="spellEnd"/>
-      <w:r>
-        <w:t xml:space="preserve"> de la </w:t>
-      </w:r>
-      <w:proofErr w:type="spellStart"/>
-      <w:r>
-        <w:t>instancia</w:t>
-      </w:r>
-      <w:proofErr w:type="spellEnd"/>
-      <w:r>
-        <w:t>:</w:t>
-      </w:r>
-    </w:p>
-    <w:p>
-      <w:r>
+    <w:p>
+      <w:pPr>
+        <w:jc w:val="both"/>
+        <w:rPr>
+          <w:lang w:val="es-ES"/>
+        </w:rPr>
+      </w:pPr>
+    </w:p>
+    <w:p>
+      <w:pPr>
+        <w:jc w:val="both"/>
+        <w:rPr>
+          <w:lang w:val="es-ES"/>
+        </w:rPr>
+      </w:pPr>
+      <w:r>
+        <w:rPr>
+          <w:lang w:val="es-ES"/>
+        </w:rPr>
+        <w:t>Creación de la instancia:</w:t>
+      </w:r>
+    </w:p>
+    <w:p>
+      <w:pPr>
+        <w:jc w:val="both"/>
+        <w:rPr>
+          <w:lang w:val="es-ES"/>
+        </w:rPr>
+      </w:pPr>
+      <w:r>
+        <w:rPr>
+          <w:lang w:val="es-ES"/>
+        </w:rPr>
         <w:drawing>
           <wp:inline distT="0" distB="0" distL="0" distR="0" wp14:anchorId="552C141D" wp14:editId="366ACC5C">
             <wp:extent cx="5943600" cy="3694430"/>
             <wp:effectExtent l="0" t="0" r="0" b="1270"/>
             <wp:docPr id="1" name="Picture 1"/>
-            <wp:cNvGraphicFramePr>
-              <a:graphicFrameLocks xmlns:a="http://schemas.openxmlformats.org/drawingml/2006/main" noChangeAspect="1"/>
-            </wp:cNvGraphicFramePr>
-            <a:graphic xmlns:a="http://schemas.openxmlformats.org/drawingml/2006/main">
-              <a:graphicData uri="http://schemas.openxmlformats.org/drawingml/2006/picture">
-                <pic:pic xmlns:pic="http://schemas.openxmlformats.org/drawingml/2006/picture">
-                  <pic:nvPicPr>
-                    <pic:cNvPr id="1" name=""/>
-                    <pic:cNvPicPr/>
-                  </pic:nvPicPr>
-                  <pic:blipFill>
-                    <a:blip r:embed="rId4"/>
-                    <a:stretch>
-                      <a:fillRect/>
-                    </a:stretch>
-                  </pic:blipFill>
-                  <pic:spPr>
-                    <a:xfrm>
-                      <a:off x="0" y="0"/>
-                      <a:ext cx="5943600" cy="3694430"/>
-                    </a:xfrm>
-                    <a:prstGeom prst="rect">
-                      <a:avLst/>
-                    </a:prstGeom>
-                  </pic:spPr>
-                </pic:pic>
-              </a:graphicData>
-            </a:graphic>
-          </wp:inline>
-        </w:drawing>
-      </w:r>
-    </w:p>
-    <w:p/>
-    <w:p>
-      <w:proofErr w:type="spellStart"/>
-      <w:r>
-        <w:t>Conexión</w:t>
-      </w:r>
-      <w:proofErr w:type="spellEnd"/>
-      <w:r>
-        <w:t xml:space="preserve"> de la terminal </w:t>
-      </w:r>
-      <w:proofErr w:type="gramStart"/>
-      <w:r>
-        <w:t>con</w:t>
-      </w:r>
-      <w:proofErr w:type="gramEnd"/>
-      <w:r>
-        <w:t xml:space="preserve"> la </w:t>
-      </w:r>
-      <w:proofErr w:type="spellStart"/>
-      <w:r>
-        <w:t>instancia</w:t>
-      </w:r>
-      <w:proofErr w:type="spellEnd"/>
-    </w:p>
-    <w:p>
-      <w:r>
-        <w:drawing>
-          <wp:inline distT="0" distB="0" distL="0" distR="0" wp14:anchorId="35E6882E" wp14:editId="1A357DDF">
-            <wp:extent cx="3979953" cy="2507030"/>
-            <wp:effectExtent l="0" t="0" r="0" b="0"/>
-            <wp:docPr id="2" name="Picture 2"/>
             <wp:cNvGraphicFramePr>
               <a:graphicFrameLocks xmlns:a="http://schemas.openxmlformats.org/drawingml/2006/main" noChangeAspect="1"/>
             </wp:cNvGraphicFramePr>
@@ -128,7 +79,7 @@
                   <pic:spPr>
                     <a:xfrm>
                       <a:off x="0" y="0"/>
-                      <a:ext cx="3986840" cy="2511368"/>
+                      <a:ext cx="5943600" cy="3694430"/>
                     </a:xfrm>
                     <a:prstGeom prst="rect">
                       <a:avLst/>
@@ -141,59 +92,44 @@
         </w:drawing>
       </w:r>
     </w:p>
-    <w:p/>
-    <w:p/>
-    <w:p/>
-    <w:p/>
-    <w:p/>
-    <w:p>
-      <w:proofErr w:type="spellStart"/>
-      <w:r>
-        <w:lastRenderedPageBreak/>
-        <w:t>Mlflow</w:t>
-      </w:r>
-      <w:proofErr w:type="spellEnd"/>
-      <w:r>
-        <w:t xml:space="preserve"> </w:t>
-      </w:r>
-      <w:proofErr w:type="spellStart"/>
-      <w:r>
-        <w:t>corriendo</w:t>
-      </w:r>
-      <w:proofErr w:type="spellEnd"/>
-      <w:r>
-        <w:t xml:space="preserve"> </w:t>
-      </w:r>
-      <w:proofErr w:type="spellStart"/>
-      <w:r>
-        <w:t>en</w:t>
-      </w:r>
-      <w:proofErr w:type="spellEnd"/>
-      <w:r>
-        <w:t xml:space="preserve"> la </w:t>
-      </w:r>
-      <w:proofErr w:type="spellStart"/>
-      <w:r>
-        <w:t>instancia</w:t>
-      </w:r>
-      <w:proofErr w:type="spellEnd"/>
-      <w:r>
-        <w:t xml:space="preserve"> ip </w:t>
-      </w:r>
-      <w:r>
-        <w:t>98.88.32.89</w:t>
-      </w:r>
-      <w:r>
-        <w:t>:</w:t>
-      </w:r>
-    </w:p>
-    <w:p>
-      <w:r>
+    <w:p>
+      <w:pPr>
+        <w:jc w:val="both"/>
+        <w:rPr>
+          <w:lang w:val="es-ES"/>
+        </w:rPr>
+      </w:pPr>
+    </w:p>
+    <w:p>
+      <w:pPr>
+        <w:jc w:val="both"/>
+        <w:rPr>
+          <w:lang w:val="es-ES"/>
+        </w:rPr>
+      </w:pPr>
+      <w:r>
+        <w:rPr>
+          <w:lang w:val="es-ES"/>
+        </w:rPr>
+        <w:t>Conexión de la terminal con la instancia</w:t>
+      </w:r>
+    </w:p>
+    <w:p>
+      <w:pPr>
+        <w:jc w:val="both"/>
+        <w:rPr>
+          <w:lang w:val="es-ES"/>
+        </w:rPr>
+      </w:pPr>
+      <w:r>
+        <w:rPr>
+          <w:lang w:val="es-ES"/>
+        </w:rPr>
         <w:drawing>
-          <wp:inline distT="0" distB="0" distL="0" distR="0" wp14:anchorId="786D7764" wp14:editId="37AB5F13">
-            <wp:extent cx="4681001" cy="1706365"/>
-            <wp:effectExtent l="0" t="0" r="5715" b="0"/>
-            <wp:docPr id="3" name="Picture 3"/>
+          <wp:inline distT="0" distB="0" distL="0" distR="0" wp14:anchorId="35E6882E" wp14:editId="1A357DDF">
+            <wp:extent cx="3979953" cy="2507030"/>
+            <wp:effectExtent l="0" t="0" r="0" b="0"/>
+            <wp:docPr id="2" name="Picture 2"/>
             <wp:cNvGraphicFramePr>
               <a:graphicFrameLocks xmlns:a="http://schemas.openxmlformats.org/drawingml/2006/main" noChangeAspect="1"/>
             </wp:cNvGraphicFramePr>
@@ -213,7 +149,7 @@
                   <pic:spPr>
                     <a:xfrm>
                       <a:off x="0" y="0"/>
-                      <a:ext cx="4697876" cy="1712517"/>
+                      <a:ext cx="3986840" cy="2511368"/>
                     </a:xfrm>
                     <a:prstGeom prst="rect">
                       <a:avLst/>
@@ -226,56 +162,129 @@
         </w:drawing>
       </w:r>
     </w:p>
-    <w:p/>
-    <w:p>
+    <w:p>
+      <w:pPr>
+        <w:jc w:val="both"/>
+        <w:rPr>
+          <w:lang w:val="es-ES"/>
+        </w:rPr>
+      </w:pPr>
+    </w:p>
+    <w:p>
+      <w:pPr>
+        <w:jc w:val="both"/>
+        <w:rPr>
+          <w:lang w:val="es-ES"/>
+        </w:rPr>
+      </w:pPr>
+    </w:p>
+    <w:p>
+      <w:pPr>
+        <w:jc w:val="both"/>
+        <w:rPr>
+          <w:lang w:val="es-ES"/>
+        </w:rPr>
+      </w:pPr>
+    </w:p>
+    <w:p>
+      <w:pPr>
+        <w:jc w:val="both"/>
+        <w:rPr>
+          <w:lang w:val="es-ES"/>
+        </w:rPr>
+      </w:pPr>
+    </w:p>
+    <w:p>
+      <w:pPr>
+        <w:jc w:val="both"/>
+        <w:rPr>
+          <w:lang w:val="es-ES"/>
+        </w:rPr>
+      </w:pPr>
+    </w:p>
+    <w:p>
+      <w:pPr>
+        <w:jc w:val="both"/>
+        <w:rPr>
+          <w:lang w:val="es-ES"/>
+        </w:rPr>
+      </w:pPr>
       <w:proofErr w:type="spellStart"/>
       <w:r>
-        <w:t>Experimentos</w:t>
+        <w:rPr>
+          <w:lang w:val="es-ES"/>
+        </w:rPr>
+        <w:lastRenderedPageBreak/>
+        <w:t>Mlflow</w:t>
       </w:r>
       <w:proofErr w:type="spellEnd"/>
       <w:r>
+        <w:rPr>
+          <w:lang w:val="es-ES"/>
+        </w:rPr>
         <w:t xml:space="preserve"> </w:t>
       </w:r>
+      <w:r>
+        <w:rPr>
+          <w:lang w:val="es-ES"/>
+        </w:rPr>
+        <w:t>corriendo</w:t>
+      </w:r>
+      <w:r>
+        <w:rPr>
+          <w:lang w:val="es-ES"/>
+        </w:rPr>
+        <w:t xml:space="preserve"> </w:t>
+      </w:r>
+      <w:r>
+        <w:rPr>
+          <w:lang w:val="es-ES"/>
+        </w:rPr>
+        <w:t xml:space="preserve">en la instancia </w:t>
+      </w:r>
       <w:proofErr w:type="spellStart"/>
       <w:r>
-        <w:t>iniciales</w:t>
+        <w:rPr>
+          <w:lang w:val="es-ES"/>
+        </w:rPr>
+        <w:t>ip</w:t>
       </w:r>
       <w:proofErr w:type="spellEnd"/>
       <w:r>
+        <w:rPr>
+          <w:lang w:val="es-ES"/>
+        </w:rPr>
         <w:t xml:space="preserve"> </w:t>
       </w:r>
-      <w:proofErr w:type="spellStart"/>
-      <w:r>
-        <w:t>registrados</w:t>
-      </w:r>
-      <w:proofErr w:type="spellEnd"/>
-      <w:r>
-        <w:t xml:space="preserve"> </w:t>
-      </w:r>
-      <w:proofErr w:type="spellStart"/>
-      <w:r>
-        <w:t>en</w:t>
-      </w:r>
-      <w:proofErr w:type="spellEnd"/>
-      <w:r>
-        <w:t xml:space="preserve"> </w:t>
-      </w:r>
-      <w:proofErr w:type="spellStart"/>
-      <w:r>
-        <w:t>mlflow</w:t>
-      </w:r>
-      <w:proofErr w:type="spellEnd"/>
-      <w:r>
+      <w:r>
+        <w:rPr>
+          <w:lang w:val="es-ES"/>
+        </w:rPr>
+        <w:t>98.88.32.89</w:t>
+      </w:r>
+      <w:r>
+        <w:rPr>
+          <w:lang w:val="es-ES"/>
+        </w:rPr>
         <w:t>:</w:t>
       </w:r>
     </w:p>
     <w:p>
-      <w:r>
+      <w:pPr>
+        <w:jc w:val="both"/>
+        <w:rPr>
+          <w:lang w:val="es-ES"/>
+        </w:rPr>
+      </w:pPr>
+      <w:r>
+        <w:rPr>
+          <w:lang w:val="es-ES"/>
+        </w:rPr>
         <w:drawing>
-          <wp:inline distT="0" distB="0" distL="0" distR="0" wp14:anchorId="14D98E75" wp14:editId="6777E4D8">
-            <wp:extent cx="3324540" cy="2127563"/>
-            <wp:effectExtent l="0" t="0" r="3175" b="6350"/>
-            <wp:docPr id="4" name="Picture 4"/>
+          <wp:inline distT="0" distB="0" distL="0" distR="0" wp14:anchorId="786D7764" wp14:editId="37AB5F13">
+            <wp:extent cx="4681001" cy="1706365"/>
+            <wp:effectExtent l="0" t="0" r="5715" b="0"/>
+            <wp:docPr id="3" name="Picture 3"/>
             <wp:cNvGraphicFramePr>
               <a:graphicFrameLocks xmlns:a="http://schemas.openxmlformats.org/drawingml/2006/main" noChangeAspect="1"/>
             </wp:cNvGraphicFramePr>
@@ -295,7 +304,7 @@
                   <pic:spPr>
                     <a:xfrm>
                       <a:off x="0" y="0"/>
-                      <a:ext cx="3358411" cy="2149239"/>
+                      <a:ext cx="4697876" cy="1712517"/>
                     </a:xfrm>
                     <a:prstGeom prst="rect">
                       <a:avLst/>
@@ -307,17 +316,59 @@
           </wp:inline>
         </w:drawing>
       </w:r>
-      <w:r>
-        <w:t xml:space="preserve"> </w:t>
-      </w:r>
-    </w:p>
-    <w:p>
-      <w:r>
+    </w:p>
+    <w:p>
+      <w:pPr>
+        <w:jc w:val="both"/>
+        <w:rPr>
+          <w:lang w:val="es-ES"/>
+        </w:rPr>
+      </w:pPr>
+    </w:p>
+    <w:p>
+      <w:pPr>
+        <w:jc w:val="both"/>
+        <w:rPr>
+          <w:lang w:val="es-ES"/>
+        </w:rPr>
+      </w:pPr>
+      <w:r>
+        <w:rPr>
+          <w:lang w:val="es-ES"/>
+        </w:rPr>
+        <w:t xml:space="preserve">Experimentos iniciales registrados en </w:t>
+      </w:r>
+      <w:proofErr w:type="spellStart"/>
+      <w:r>
+        <w:rPr>
+          <w:lang w:val="es-ES"/>
+        </w:rPr>
+        <w:t>mlflow</w:t>
+      </w:r>
+      <w:proofErr w:type="spellEnd"/>
+      <w:r>
+        <w:rPr>
+          <w:lang w:val="es-ES"/>
+        </w:rPr>
+        <w:t>:</w:t>
+      </w:r>
+    </w:p>
+    <w:p>
+      <w:pPr>
+        <w:jc w:val="both"/>
+        <w:rPr>
+          <w:lang w:val="es-ES"/>
+        </w:rPr>
+      </w:pPr>
+      <w:r>
+        <w:rPr>
+          <w:lang w:val="es-ES"/>
+        </w:rPr>
         <w:drawing>
-          <wp:inline distT="0" distB="0" distL="0" distR="0" wp14:anchorId="082A0DAB" wp14:editId="0C216A43">
-            <wp:extent cx="5943600" cy="3237865"/>
-            <wp:effectExtent l="0" t="0" r="0" b="635"/>
-            <wp:docPr id="7" name="Picture 7"/>
+          <wp:inline distT="0" distB="0" distL="0" distR="0" wp14:anchorId="14D98E75" wp14:editId="6777E4D8">
+            <wp:extent cx="3324540" cy="2127563"/>
+            <wp:effectExtent l="0" t="0" r="3175" b="6350"/>
+            <wp:docPr id="4" name="Picture 4"/>
             <wp:cNvGraphicFramePr>
               <a:graphicFrameLocks xmlns:a="http://schemas.openxmlformats.org/drawingml/2006/main" noChangeAspect="1"/>
             </wp:cNvGraphicFramePr>
@@ -337,7 +388,7 @@
                   <pic:spPr>
                     <a:xfrm>
                       <a:off x="0" y="0"/>
-                      <a:ext cx="5943600" cy="3237865"/>
+                      <a:ext cx="3358411" cy="2149239"/>
                     </a:xfrm>
                     <a:prstGeom prst="rect">
                       <a:avLst/>
@@ -349,32 +400,29 @@
           </wp:inline>
         </w:drawing>
       </w:r>
-    </w:p>
-    <w:p/>
-    <w:p/>
-    <w:p/>
-    <w:p>
-      <w:r>
-        <w:lastRenderedPageBreak/>
-        <w:t xml:space="preserve">Nuevo </w:t>
-      </w:r>
-      <w:proofErr w:type="spellStart"/>
-      <w:r>
-        <w:t>experimento</w:t>
-      </w:r>
-      <w:proofErr w:type="spellEnd"/>
-      <w:r>
-        <w:t>:</w:t>
-      </w:r>
-    </w:p>
-    <w:p/>
-    <w:p>
-      <w:r>
+      <w:r>
+        <w:rPr>
+          <w:lang w:val="es-ES"/>
+        </w:rPr>
+        <w:t xml:space="preserve"> </w:t>
+      </w:r>
+    </w:p>
+    <w:p>
+      <w:pPr>
+        <w:jc w:val="both"/>
+        <w:rPr>
+          <w:lang w:val="es-ES"/>
+        </w:rPr>
+      </w:pPr>
+      <w:r>
+        <w:rPr>
+          <w:lang w:val="es-ES"/>
+        </w:rPr>
         <w:drawing>
-          <wp:inline distT="0" distB="0" distL="0" distR="0" wp14:anchorId="55FA7131" wp14:editId="09A44088">
-            <wp:extent cx="5943600" cy="3208655"/>
-            <wp:effectExtent l="0" t="0" r="0" b="4445"/>
-            <wp:docPr id="8" name="Picture 8"/>
+          <wp:inline distT="0" distB="0" distL="0" distR="0" wp14:anchorId="082A0DAB" wp14:editId="0C216A43">
+            <wp:extent cx="5943600" cy="3237865"/>
+            <wp:effectExtent l="0" t="0" r="0" b="635"/>
+            <wp:docPr id="7" name="Picture 7"/>
             <wp:cNvGraphicFramePr>
               <a:graphicFrameLocks xmlns:a="http://schemas.openxmlformats.org/drawingml/2006/main" noChangeAspect="1"/>
             </wp:cNvGraphicFramePr>
@@ -394,6 +442,101 @@
                   <pic:spPr>
                     <a:xfrm>
                       <a:off x="0" y="0"/>
+                      <a:ext cx="5943600" cy="3237865"/>
+                    </a:xfrm>
+                    <a:prstGeom prst="rect">
+                      <a:avLst/>
+                    </a:prstGeom>
+                  </pic:spPr>
+                </pic:pic>
+              </a:graphicData>
+            </a:graphic>
+          </wp:inline>
+        </w:drawing>
+      </w:r>
+    </w:p>
+    <w:p>
+      <w:pPr>
+        <w:jc w:val="both"/>
+        <w:rPr>
+          <w:lang w:val="es-ES"/>
+        </w:rPr>
+      </w:pPr>
+    </w:p>
+    <w:p>
+      <w:pPr>
+        <w:jc w:val="both"/>
+        <w:rPr>
+          <w:lang w:val="es-ES"/>
+        </w:rPr>
+      </w:pPr>
+    </w:p>
+    <w:p>
+      <w:pPr>
+        <w:jc w:val="both"/>
+        <w:rPr>
+          <w:lang w:val="es-ES"/>
+        </w:rPr>
+      </w:pPr>
+    </w:p>
+    <w:p>
+      <w:pPr>
+        <w:jc w:val="both"/>
+        <w:rPr>
+          <w:lang w:val="es-ES"/>
+        </w:rPr>
+      </w:pPr>
+      <w:r>
+        <w:rPr>
+          <w:lang w:val="es-ES"/>
+        </w:rPr>
+        <w:lastRenderedPageBreak/>
+        <w:t>Nuevo experimento:</w:t>
+      </w:r>
+    </w:p>
+    <w:p>
+      <w:pPr>
+        <w:jc w:val="both"/>
+        <w:rPr>
+          <w:lang w:val="es-ES"/>
+        </w:rPr>
+      </w:pPr>
+    </w:p>
+    <w:p>
+      <w:pPr>
+        <w:jc w:val="both"/>
+        <w:rPr>
+          <w:lang w:val="es-ES"/>
+        </w:rPr>
+      </w:pPr>
+      <w:r>
+        <w:rPr>
+          <w:lang w:val="es-ES"/>
+        </w:rPr>
+        <w:drawing>
+          <wp:inline distT="0" distB="0" distL="0" distR="0" wp14:anchorId="55FA7131" wp14:editId="09A44088">
+            <wp:extent cx="5943600" cy="3208655"/>
+            <wp:effectExtent l="0" t="0" r="0" b="4445"/>
+            <wp:docPr id="8" name="Picture 8"/>
+            <wp:cNvGraphicFramePr>
+              <a:graphicFrameLocks xmlns:a="http://schemas.openxmlformats.org/drawingml/2006/main" noChangeAspect="1"/>
+            </wp:cNvGraphicFramePr>
+            <a:graphic xmlns:a="http://schemas.openxmlformats.org/drawingml/2006/main">
+              <a:graphicData uri="http://schemas.openxmlformats.org/drawingml/2006/picture">
+                <pic:pic xmlns:pic="http://schemas.openxmlformats.org/drawingml/2006/picture">
+                  <pic:nvPicPr>
+                    <pic:cNvPr id="1" name=""/>
+                    <pic:cNvPicPr/>
+                  </pic:nvPicPr>
+                  <pic:blipFill>
+                    <a:blip r:embed="rId10"/>
+                    <a:stretch>
+                      <a:fillRect/>
+                    </a:stretch>
+                  </pic:blipFill>
+                  <pic:spPr>
+                    <a:xfrm>
+                      <a:off x="0" y="0"/>
                       <a:ext cx="5943600" cy="3208655"/>
                     </a:xfrm>
                     <a:prstGeom prst="rect">
@@ -407,50 +550,1517 @@
         </w:drawing>
       </w:r>
     </w:p>
-    <w:p/>
-    <w:p/>
-    <w:p/>
-    <w:p/>
-    <w:p/>
-    <w:p/>
-    <w:p/>
-    <w:p/>
-    <w:p/>
-    <w:p/>
-    <w:p/>
-    <w:p/>
-    <w:p/>
-    <w:p/>
-    <w:p/>
-    <w:p/>
-    <w:p/>
-    <w:p/>
-    <w:p/>
-    <w:p/>
-    <w:p/>
-    <w:p/>
-    <w:p/>
-    <w:p/>
-    <w:p>
+    <w:p>
+      <w:pPr>
+        <w:jc w:val="both"/>
+        <w:rPr>
+          <w:lang w:val="es-ES"/>
+        </w:rPr>
+      </w:pPr>
+    </w:p>
+    <w:p>
+      <w:pPr>
+        <w:jc w:val="both"/>
+        <w:rPr>
+          <w:lang w:val="es-ES"/>
+        </w:rPr>
+      </w:pPr>
+    </w:p>
+    <w:p>
+      <w:pPr>
+        <w:jc w:val="both"/>
+        <w:rPr>
+          <w:lang w:val="es-ES"/>
+        </w:rPr>
+      </w:pPr>
+    </w:p>
+    <w:p>
+      <w:pPr>
+        <w:jc w:val="both"/>
+        <w:rPr>
+          <w:lang w:val="es-ES"/>
+        </w:rPr>
+      </w:pPr>
+    </w:p>
+    <w:p>
+      <w:pPr>
+        <w:jc w:val="both"/>
+        <w:rPr>
+          <w:lang w:val="es-ES"/>
+        </w:rPr>
+      </w:pPr>
+    </w:p>
+    <w:p>
+      <w:pPr>
+        <w:jc w:val="both"/>
+        <w:rPr>
+          <w:lang w:val="es-ES"/>
+        </w:rPr>
+      </w:pPr>
+    </w:p>
+    <w:p>
+      <w:pPr>
+        <w:jc w:val="both"/>
+        <w:rPr>
+          <w:lang w:val="es-ES"/>
+        </w:rPr>
+      </w:pPr>
+    </w:p>
+    <w:p>
+      <w:pPr>
+        <w:jc w:val="both"/>
+        <w:rPr>
+          <w:lang w:val="es-ES"/>
+        </w:rPr>
+      </w:pPr>
+    </w:p>
+    <w:p>
+      <w:pPr>
+        <w:jc w:val="both"/>
+        <w:rPr>
+          <w:lang w:val="es-ES"/>
+        </w:rPr>
+      </w:pPr>
+    </w:p>
+    <w:p>
+      <w:pPr>
+        <w:jc w:val="both"/>
+        <w:rPr>
+          <w:lang w:val="es-ES"/>
+        </w:rPr>
+      </w:pPr>
+    </w:p>
+    <w:p>
+      <w:pPr>
+        <w:jc w:val="both"/>
+        <w:rPr>
+          <w:lang w:val="es-ES"/>
+        </w:rPr>
+      </w:pPr>
+    </w:p>
+    <w:p>
+      <w:pPr>
+        <w:jc w:val="both"/>
+        <w:rPr>
+          <w:lang w:val="es-ES"/>
+        </w:rPr>
+      </w:pPr>
+    </w:p>
+    <w:p>
+      <w:pPr>
+        <w:jc w:val="both"/>
+        <w:rPr>
+          <w:lang w:val="es-ES"/>
+        </w:rPr>
+      </w:pPr>
+    </w:p>
+    <w:p>
+      <w:pPr>
+        <w:jc w:val="both"/>
+        <w:rPr>
+          <w:lang w:val="es-ES"/>
+        </w:rPr>
+      </w:pPr>
+    </w:p>
+    <w:p>
+      <w:pPr>
+        <w:jc w:val="both"/>
+        <w:rPr>
+          <w:lang w:val="es-ES"/>
+        </w:rPr>
+      </w:pPr>
+    </w:p>
+    <w:p>
+      <w:pPr>
+        <w:jc w:val="both"/>
+        <w:rPr>
+          <w:lang w:val="es-ES"/>
+        </w:rPr>
+      </w:pPr>
+    </w:p>
+    <w:p>
+      <w:pPr>
+        <w:jc w:val="both"/>
+        <w:rPr>
+          <w:lang w:val="es-ES"/>
+        </w:rPr>
+      </w:pPr>
+    </w:p>
+    <w:p>
+      <w:pPr>
+        <w:jc w:val="both"/>
+        <w:rPr>
+          <w:lang w:val="es-ES"/>
+        </w:rPr>
+      </w:pPr>
+    </w:p>
+    <w:p>
+      <w:pPr>
+        <w:jc w:val="both"/>
+        <w:rPr>
+          <w:lang w:val="es-ES"/>
+        </w:rPr>
+      </w:pPr>
+    </w:p>
+    <w:p>
+      <w:pPr>
+        <w:jc w:val="both"/>
+        <w:rPr>
+          <w:lang w:val="es-ES"/>
+        </w:rPr>
+      </w:pPr>
+    </w:p>
+    <w:p>
+      <w:pPr>
+        <w:jc w:val="both"/>
+        <w:rPr>
+          <w:lang w:val="es-ES"/>
+        </w:rPr>
+      </w:pPr>
+    </w:p>
+    <w:p>
+      <w:pPr>
+        <w:jc w:val="both"/>
+        <w:rPr>
+          <w:lang w:val="es-ES"/>
+        </w:rPr>
+      </w:pPr>
+    </w:p>
+    <w:p>
+      <w:pPr>
+        <w:jc w:val="both"/>
+        <w:rPr>
+          <w:lang w:val="es-ES"/>
+        </w:rPr>
+      </w:pPr>
+    </w:p>
+    <w:p>
+      <w:pPr>
+        <w:jc w:val="both"/>
+        <w:rPr>
+          <w:lang w:val="es-ES"/>
+        </w:rPr>
+      </w:pPr>
+    </w:p>
+    <w:p>
+      <w:pPr>
+        <w:jc w:val="both"/>
+        <w:rPr>
+          <w:b/>
+          <w:bCs/>
+          <w:lang w:val="es-ES"/>
+        </w:rPr>
+      </w:pPr>
+      <w:r>
+        <w:rPr>
+          <w:b/>
+          <w:bCs/>
+          <w:lang w:val="es-ES"/>
+        </w:rPr>
+        <w:lastRenderedPageBreak/>
+        <w:t>Resumen Ejecutivo</w:t>
+      </w:r>
+    </w:p>
+    <w:p>
+      <w:pPr>
+        <w:jc w:val="both"/>
+        <w:rPr>
+          <w:b/>
+          <w:bCs/>
+          <w:lang w:val="es-ES"/>
+        </w:rPr>
+      </w:pPr>
+    </w:p>
+    <w:p>
+      <w:pPr>
+        <w:jc w:val="both"/>
+        <w:rPr>
+          <w:lang w:val="es-ES"/>
+        </w:rPr>
+      </w:pPr>
+      <w:r>
+        <w:rPr>
+          <w:lang w:val="es-ES"/>
+        </w:rPr>
+        <w:t>El objetivo del proyecto fue predecir el estado de suscripción y el monto de compra de los clientes. Tras una fase inicial con resultados deficientes, se aplicaron técnicas de </w:t>
+      </w:r>
+      <w:r>
+        <w:rPr>
+          <w:b/>
+          <w:bCs/>
+          <w:lang w:val="es-ES"/>
+        </w:rPr>
+        <w:t>ingeniería de características</w:t>
+      </w:r>
+      <w:r>
+        <w:rPr>
+          <w:lang w:val="es-ES"/>
+        </w:rPr>
+        <w:t> y </w:t>
+      </w:r>
+      <w:r>
+        <w:rPr>
+          <w:b/>
+          <w:bCs/>
+          <w:lang w:val="es-ES"/>
+        </w:rPr>
+        <w:t>ajuste de desbalance de clases</w:t>
+      </w:r>
+      <w:r>
+        <w:rPr>
+          <w:lang w:val="es-ES"/>
+        </w:rPr>
+        <w:t xml:space="preserve">, logrando un modelo de clasificación altamente efectivo (F1=0.78), mientras que se determinó que el monto de compra en este </w:t>
+      </w:r>
       <w:proofErr w:type="spellStart"/>
       <w:r>
+        <w:rPr>
+          <w:lang w:val="es-ES"/>
+        </w:rPr>
+        <w:t>dataset</w:t>
+      </w:r>
+      <w:proofErr w:type="spellEnd"/>
+      <w:r>
+        <w:rPr>
+          <w:lang w:val="es-ES"/>
+        </w:rPr>
+        <w:t xml:space="preserve"> posee una naturaleza estocástica no predecible con las variables actuales.</w:t>
+      </w:r>
+    </w:p>
+    <w:p>
+      <w:pPr>
+        <w:jc w:val="both"/>
+        <w:rPr>
+          <w:lang w:val="es-ES"/>
+        </w:rPr>
+      </w:pPr>
+    </w:p>
+    <w:p>
+      <w:pPr>
+        <w:jc w:val="both"/>
+        <w:rPr>
+          <w:b/>
+          <w:bCs/>
+          <w:lang w:val="es-ES"/>
+        </w:rPr>
+      </w:pPr>
+      <w:r>
+        <w:rPr>
+          <w:b/>
+          <w:bCs/>
+          <w:lang w:val="es-ES"/>
+        </w:rPr>
+        <w:t>Diagnóstico de la Iteración Inicial</w:t>
+      </w:r>
+    </w:p>
+    <w:p>
+      <w:pPr>
+        <w:jc w:val="both"/>
+        <w:rPr>
+          <w:lang w:val="es-ES"/>
+        </w:rPr>
+      </w:pPr>
+      <w:r>
+        <w:rPr>
+          <w:lang w:val="es-ES"/>
+        </w:rPr>
+        <w:t>En la primera etapa, los modelos presentaron un desempeño crítico:</w:t>
+      </w:r>
+    </w:p>
+    <w:p>
+      <w:pPr>
+        <w:jc w:val="both"/>
+        <w:rPr>
+          <w:lang w:val="es-ES"/>
+        </w:rPr>
+      </w:pPr>
+    </w:p>
+    <w:p>
+      <w:pPr>
+        <w:numPr>
+          <w:ilvl w:val="0"/>
+          <w:numId w:val="1"/>
+        </w:numPr>
+        <w:jc w:val="both"/>
+        <w:rPr>
+          <w:lang w:val="es-ES"/>
+        </w:rPr>
+      </w:pPr>
+      <w:r>
+        <w:rPr>
+          <w:b/>
+          <w:bCs/>
+          <w:lang w:val="es-ES"/>
+        </w:rPr>
+        <w:t>Clasificación:</w:t>
+      </w:r>
+      <w:r>
+        <w:rPr>
+          <w:lang w:val="es-ES"/>
+        </w:rPr>
+        <w:t xml:space="preserve"> El modelo sufría de la "Paradoja de la Exactitud". Con un </w:t>
+      </w:r>
+      <w:proofErr w:type="spellStart"/>
+      <w:r>
+        <w:rPr>
+          <w:lang w:val="es-ES"/>
+        </w:rPr>
+        <w:t>Accuracy</w:t>
+      </w:r>
+      <w:proofErr w:type="spellEnd"/>
+      <w:r>
+        <w:rPr>
+          <w:lang w:val="es-ES"/>
+        </w:rPr>
+        <w:t xml:space="preserve"> del 72% pero un </w:t>
+      </w:r>
+      <w:r>
+        <w:rPr>
+          <w:b/>
+          <w:bCs/>
+          <w:lang w:val="es-ES"/>
+        </w:rPr>
+        <w:t>F1-Score de 0.11</w:t>
+      </w:r>
+      <w:r>
+        <w:rPr>
+          <w:lang w:val="es-ES"/>
+        </w:rPr>
+        <w:t>, el modelo ignoraba sistemáticamente a los suscriptores.</w:t>
+      </w:r>
+    </w:p>
+    <w:p>
+      <w:pPr>
+        <w:ind w:left="720"/>
+        <w:jc w:val="both"/>
+        <w:rPr>
+          <w:lang w:val="es-ES"/>
+        </w:rPr>
+      </w:pPr>
+    </w:p>
+    <w:p>
+      <w:pPr>
+        <w:numPr>
+          <w:ilvl w:val="0"/>
+          <w:numId w:val="1"/>
+        </w:numPr>
+        <w:jc w:val="both"/>
+        <w:rPr>
+          <w:lang w:val="es-ES"/>
+        </w:rPr>
+      </w:pPr>
+      <w:r>
+        <w:rPr>
+          <w:b/>
+          <w:bCs/>
+          <w:lang w:val="es-ES"/>
+        </w:rPr>
+        <w:t>Regresión:</w:t>
+      </w:r>
+      <w:r>
+        <w:rPr>
+          <w:lang w:val="es-ES"/>
+        </w:rPr>
+        <w:t> El R2 negativo indicó que las variables originales no tenían correlación con el monto de compra, siendo superadas por una predicción basada simplemente en el promedio.</w:t>
+      </w:r>
+    </w:p>
+    <w:p>
+      <w:pPr>
+        <w:pStyle w:val="ListParagraph"/>
+        <w:rPr>
+          <w:lang w:val="es-ES"/>
+        </w:rPr>
+      </w:pPr>
+    </w:p>
+    <w:p>
+      <w:pPr>
+        <w:jc w:val="both"/>
+        <w:rPr>
+          <w:b/>
+          <w:bCs/>
+          <w:lang w:val="es-ES"/>
+        </w:rPr>
+      </w:pPr>
+      <w:r>
+        <w:rPr>
+          <w:b/>
+          <w:bCs/>
+          <w:lang w:val="es-ES"/>
+        </w:rPr>
+        <w:t xml:space="preserve">Estrategia de Mejora (Data </w:t>
+      </w:r>
+      <w:proofErr w:type="spellStart"/>
+      <w:r>
+        <w:rPr>
+          <w:b/>
+          <w:bCs/>
+          <w:lang w:val="es-ES"/>
+        </w:rPr>
+        <w:t>Engineering</w:t>
+      </w:r>
+      <w:proofErr w:type="spellEnd"/>
+      <w:r>
+        <w:rPr>
+          <w:b/>
+          <w:bCs/>
+          <w:lang w:val="es-ES"/>
+        </w:rPr>
+        <w:t>)</w:t>
+      </w:r>
+    </w:p>
+    <w:p>
+      <w:pPr>
+        <w:jc w:val="both"/>
+        <w:rPr>
+          <w:b/>
+          <w:bCs/>
+          <w:lang w:val="es-ES"/>
+        </w:rPr>
+      </w:pPr>
+    </w:p>
+    <w:p>
+      <w:pPr>
+        <w:jc w:val="both"/>
+        <w:rPr>
+          <w:lang w:val="es-ES"/>
+        </w:rPr>
+      </w:pPr>
+      <w:r>
+        <w:rPr>
+          <w:lang w:val="es-ES"/>
+        </w:rPr>
+        <w:t xml:space="preserve">Para rescatar el valor del modelo, se implementaron los siguientes cambios en el pipeline de </w:t>
+      </w:r>
+      <w:proofErr w:type="spellStart"/>
+      <w:r>
+        <w:rPr>
+          <w:lang w:val="es-ES"/>
+        </w:rPr>
+        <w:t>preprocesamiento</w:t>
+      </w:r>
+      <w:proofErr w:type="spellEnd"/>
+      <w:r>
+        <w:rPr>
+          <w:lang w:val="es-ES"/>
+        </w:rPr>
+        <w:t>:</w:t>
+      </w:r>
+    </w:p>
+    <w:p>
+      <w:pPr>
+        <w:jc w:val="both"/>
+        <w:rPr>
+          <w:lang w:val="es-ES"/>
+        </w:rPr>
+      </w:pPr>
+    </w:p>
+    <w:p>
+      <w:pPr>
+        <w:pStyle w:val="ListParagraph"/>
+        <w:numPr>
+          <w:ilvl w:val="0"/>
+          <w:numId w:val="2"/>
+        </w:numPr>
+        <w:jc w:val="both"/>
+        <w:rPr>
+          <w:lang w:val="es-ES"/>
+        </w:rPr>
+      </w:pPr>
+      <w:r>
+        <w:rPr>
+          <w:lang w:val="es-ES"/>
+        </w:rPr>
+        <w:t xml:space="preserve">Creación de Interacciones: Se generaron variables como </w:t>
+      </w:r>
+      <w:proofErr w:type="spellStart"/>
+      <w:r>
+        <w:rPr>
+          <w:lang w:val="es-ES"/>
+        </w:rPr>
+        <w:t>Age_x_Freq</w:t>
+      </w:r>
+      <w:proofErr w:type="spellEnd"/>
+      <w:r>
+        <w:rPr>
+          <w:lang w:val="es-ES"/>
+        </w:rPr>
+        <w:t xml:space="preserve"> y </w:t>
+      </w:r>
+      <w:proofErr w:type="spellStart"/>
+      <w:r>
+        <w:rPr>
+          <w:lang w:val="es-ES"/>
+        </w:rPr>
+        <w:t>Total_Engagement</w:t>
+      </w:r>
+      <w:proofErr w:type="spellEnd"/>
+      <w:r>
+        <w:rPr>
+          <w:lang w:val="es-ES"/>
+        </w:rPr>
+        <w:t xml:space="preserve"> (compras previas × calificación) para capturar patrones de comportamiento no lineales.</w:t>
+      </w:r>
+    </w:p>
+    <w:p>
+      <w:pPr>
+        <w:jc w:val="both"/>
+        <w:rPr>
+          <w:lang w:val="es-ES"/>
+        </w:rPr>
+      </w:pPr>
+    </w:p>
+    <w:p>
+      <w:pPr>
+        <w:pStyle w:val="ListParagraph"/>
+        <w:numPr>
+          <w:ilvl w:val="0"/>
+          <w:numId w:val="2"/>
+        </w:numPr>
+        <w:jc w:val="both"/>
+        <w:rPr>
+          <w:lang w:val="es-ES"/>
+        </w:rPr>
+      </w:pPr>
+      <w:r>
+        <w:rPr>
+          <w:lang w:val="es-ES"/>
+        </w:rPr>
+        <w:t xml:space="preserve">Tratamiento de Frecuencia: Se transformó la variable categórica de frecuencia a una escala anual numérica real (ej. </w:t>
+      </w:r>
+      <w:proofErr w:type="spellStart"/>
+      <w:r>
+        <w:rPr>
+          <w:lang w:val="es-ES"/>
+        </w:rPr>
+        <w:t>Weekly</w:t>
+      </w:r>
+      <w:proofErr w:type="spellEnd"/>
+      <w:r>
+        <w:rPr>
+          <w:lang w:val="es-ES"/>
+        </w:rPr>
+        <w:t xml:space="preserve"> = 52), otorgando peso estadístico a la intensidad de compra.</w:t>
+      </w:r>
+    </w:p>
+    <w:p>
+      <w:pPr>
+        <w:jc w:val="both"/>
+        <w:rPr>
+          <w:lang w:val="es-ES"/>
+        </w:rPr>
+      </w:pPr>
+    </w:p>
+    <w:p>
+      <w:pPr>
+        <w:pStyle w:val="ListParagraph"/>
+        <w:numPr>
+          <w:ilvl w:val="0"/>
+          <w:numId w:val="2"/>
+        </w:numPr>
+        <w:jc w:val="both"/>
+        <w:rPr>
+          <w:lang w:val="es-ES"/>
+        </w:rPr>
+      </w:pPr>
+      <w:r>
+        <w:rPr>
+          <w:lang w:val="es-ES"/>
+        </w:rPr>
+        <w:t xml:space="preserve">Selección Estratégica: Se identificó que variables como </w:t>
+      </w:r>
+      <w:proofErr w:type="spellStart"/>
+      <w:r>
+        <w:rPr>
+          <w:lang w:val="es-ES"/>
+        </w:rPr>
+        <w:t>Gender</w:t>
+      </w:r>
+      <w:proofErr w:type="spellEnd"/>
+      <w:r>
+        <w:rPr>
+          <w:lang w:val="es-ES"/>
+        </w:rPr>
+        <w:t xml:space="preserve"> y </w:t>
+      </w:r>
+      <w:proofErr w:type="spellStart"/>
+      <w:r>
+        <w:rPr>
+          <w:lang w:val="es-ES"/>
+        </w:rPr>
+        <w:t>Has_Discount</w:t>
+      </w:r>
+      <w:proofErr w:type="spellEnd"/>
+      <w:r>
+        <w:rPr>
+          <w:lang w:val="es-ES"/>
+        </w:rPr>
+        <w:t xml:space="preserve"> eran predictores clave que estaban siendo diluidos por el ruido de otras columnas con alta </w:t>
+      </w:r>
+      <w:proofErr w:type="spellStart"/>
+      <w:r>
+        <w:rPr>
+          <w:lang w:val="es-ES"/>
+        </w:rPr>
+        <w:t>cardinalidad</w:t>
+      </w:r>
+      <w:proofErr w:type="spellEnd"/>
+      <w:r>
+        <w:rPr>
+          <w:lang w:val="es-ES"/>
+        </w:rPr>
+        <w:t>.</w:t>
+      </w:r>
+    </w:p>
+    <w:p>
+      <w:pPr>
+        <w:jc w:val="both"/>
+        <w:rPr>
+          <w:lang w:val="es-ES"/>
+        </w:rPr>
+      </w:pPr>
+    </w:p>
+    <w:p>
+      <w:pPr>
+        <w:jc w:val="both"/>
+        <w:rPr>
+          <w:b/>
+          <w:bCs/>
+          <w:lang w:val="es-ES"/>
+        </w:rPr>
+      </w:pPr>
+    </w:p>
+    <w:p>
+      <w:pPr>
+        <w:jc w:val="both"/>
+        <w:rPr>
+          <w:b/>
+          <w:bCs/>
+          <w:lang w:val="es-ES"/>
+        </w:rPr>
+      </w:pPr>
+    </w:p>
+    <w:p>
+      <w:pPr>
+        <w:jc w:val="both"/>
+        <w:rPr>
+          <w:b/>
+          <w:bCs/>
+          <w:lang w:val="es-ES"/>
+        </w:rPr>
+      </w:pPr>
+    </w:p>
+    <w:p>
+      <w:pPr>
+        <w:jc w:val="both"/>
+        <w:rPr>
+          <w:b/>
+          <w:bCs/>
+          <w:lang w:val="es-ES"/>
+        </w:rPr>
+      </w:pPr>
+    </w:p>
+    <w:p>
+      <w:pPr>
+        <w:jc w:val="both"/>
+        <w:rPr>
+          <w:b/>
+          <w:bCs/>
+          <w:lang w:val="es-ES"/>
+        </w:rPr>
+      </w:pPr>
+    </w:p>
+    <w:p>
+      <w:pPr>
+        <w:jc w:val="both"/>
+        <w:rPr>
+          <w:b/>
+          <w:bCs/>
+          <w:lang w:val="es-ES"/>
+        </w:rPr>
+      </w:pPr>
+    </w:p>
+    <w:p>
+      <w:pPr>
+        <w:jc w:val="both"/>
+        <w:rPr>
+          <w:b/>
+          <w:bCs/>
+          <w:lang w:val="es-ES"/>
+        </w:rPr>
+      </w:pPr>
+    </w:p>
+    <w:p>
+      <w:pPr>
+        <w:jc w:val="both"/>
+        <w:rPr>
+          <w:b/>
+          <w:bCs/>
+          <w:lang w:val="es-ES"/>
+        </w:rPr>
+      </w:pPr>
+    </w:p>
+    <w:p>
+      <w:pPr>
+        <w:jc w:val="both"/>
+        <w:rPr>
+          <w:b/>
+          <w:bCs/>
+          <w:lang w:val="es-ES"/>
+        </w:rPr>
+      </w:pPr>
+    </w:p>
+    <w:p>
+      <w:pPr>
+        <w:jc w:val="both"/>
+        <w:rPr>
+          <w:b/>
+          <w:bCs/>
+          <w:lang w:val="es-ES"/>
+        </w:rPr>
+      </w:pPr>
+    </w:p>
+    <w:p>
+      <w:pPr>
+        <w:jc w:val="both"/>
+        <w:rPr>
+          <w:b/>
+          <w:bCs/>
+          <w:lang w:val="es-ES"/>
+        </w:rPr>
+      </w:pPr>
+      <w:r>
+        <w:rPr>
+          <w:b/>
+          <w:bCs/>
+          <w:lang w:val="es-ES"/>
+        </w:rPr>
         <w:lastRenderedPageBreak/>
-        <w:t>Resumen</w:t>
+        <w:t>Análisis de Resultados Finales</w:t>
+      </w:r>
+    </w:p>
+    <w:p>
+      <w:pPr>
+        <w:jc w:val="both"/>
+        <w:rPr>
+          <w:b/>
+          <w:bCs/>
+          <w:lang w:val="es-ES"/>
+        </w:rPr>
+      </w:pPr>
+    </w:p>
+    <w:p>
+      <w:pPr>
+        <w:pStyle w:val="ListParagraph"/>
+        <w:numPr>
+          <w:ilvl w:val="0"/>
+          <w:numId w:val="3"/>
+        </w:numPr>
+        <w:ind w:left="426"/>
+        <w:jc w:val="both"/>
+        <w:rPr>
+          <w:lang w:val="es-ES"/>
+        </w:rPr>
+      </w:pPr>
+      <w:r>
+        <w:rPr>
+          <w:lang w:val="es-ES"/>
+        </w:rPr>
+        <w:t>Clasificación (Suscripción)</w:t>
+      </w:r>
+    </w:p>
+    <w:p>
+      <w:pPr>
+        <w:jc w:val="both"/>
+        <w:rPr>
+          <w:lang w:val="es-ES"/>
+        </w:rPr>
+      </w:pPr>
+    </w:p>
+    <w:tbl>
+      <w:tblPr>
+        <w:tblStyle w:val="TableGrid"/>
+        <w:tblW w:w="0" w:type="auto"/>
+        <w:tblLook w:val="04A0" w:firstRow="1" w:lastRow="0" w:firstColumn="1" w:lastColumn="0" w:noHBand="0" w:noVBand="1"/>
+      </w:tblPr>
+      <w:tblGrid>
+        <w:gridCol w:w="2337"/>
+        <w:gridCol w:w="2337"/>
+        <w:gridCol w:w="2338"/>
+        <w:gridCol w:w="2338"/>
+      </w:tblGrid>
+      <w:tr>
+        <w:tc>
+          <w:tcPr>
+            <w:tcW w:w="2337" w:type="dxa"/>
+          </w:tcPr>
+          <w:p>
+            <w:pPr>
+              <w:jc w:val="both"/>
+              <w:rPr>
+                <w:lang w:val="es-ES"/>
+              </w:rPr>
+            </w:pPr>
+            <w:r>
+              <w:rPr>
+                <w:lang w:val="es-ES"/>
+              </w:rPr>
+              <w:t>Modelo</w:t>
+            </w:r>
+          </w:p>
+        </w:tc>
+        <w:tc>
+          <w:tcPr>
+            <w:tcW w:w="2337" w:type="dxa"/>
+          </w:tcPr>
+          <w:p>
+            <w:pPr>
+              <w:jc w:val="both"/>
+              <w:rPr>
+                <w:lang w:val="es-ES"/>
+              </w:rPr>
+            </w:pPr>
+            <w:proofErr w:type="spellStart"/>
+            <w:r>
+              <w:rPr>
+                <w:lang w:val="es-ES"/>
+              </w:rPr>
+              <w:t>Accuracy</w:t>
+            </w:r>
+            <w:proofErr w:type="spellEnd"/>
+          </w:p>
+        </w:tc>
+        <w:tc>
+          <w:tcPr>
+            <w:tcW w:w="2338" w:type="dxa"/>
+          </w:tcPr>
+          <w:p>
+            <w:pPr>
+              <w:jc w:val="both"/>
+              <w:rPr>
+                <w:lang w:val="es-ES"/>
+              </w:rPr>
+            </w:pPr>
+            <w:r>
+              <w:rPr>
+                <w:lang w:val="es-ES"/>
+              </w:rPr>
+              <w:t>F1-Score</w:t>
+            </w:r>
+          </w:p>
+        </w:tc>
+        <w:tc>
+          <w:tcPr>
+            <w:tcW w:w="2338" w:type="dxa"/>
+          </w:tcPr>
+          <w:p>
+            <w:pPr>
+              <w:jc w:val="both"/>
+              <w:rPr>
+                <w:lang w:val="es-ES"/>
+              </w:rPr>
+            </w:pPr>
+            <w:r>
+              <w:rPr>
+                <w:lang w:val="es-ES"/>
+              </w:rPr>
+              <w:t>ROC-AUC</w:t>
+            </w:r>
+          </w:p>
+        </w:tc>
+      </w:tr>
+      <w:tr>
+        <w:tc>
+          <w:tcPr>
+            <w:tcW w:w="2337" w:type="dxa"/>
+          </w:tcPr>
+          <w:p>
+            <w:pPr>
+              <w:jc w:val="both"/>
+              <w:rPr>
+                <w:lang w:val="es-ES"/>
+              </w:rPr>
+            </w:pPr>
+            <w:proofErr w:type="spellStart"/>
+            <w:r>
+              <w:rPr>
+                <w:lang w:val="es-ES"/>
+              </w:rPr>
+              <w:t>Logistic</w:t>
+            </w:r>
+            <w:proofErr w:type="spellEnd"/>
+            <w:r>
+              <w:rPr>
+                <w:lang w:val="es-ES"/>
+              </w:rPr>
+              <w:t xml:space="preserve"> </w:t>
+            </w:r>
+            <w:proofErr w:type="spellStart"/>
+            <w:r>
+              <w:rPr>
+                <w:lang w:val="es-ES"/>
+              </w:rPr>
+              <w:t>Regression</w:t>
+            </w:r>
+            <w:proofErr w:type="spellEnd"/>
+          </w:p>
+        </w:tc>
+        <w:tc>
+          <w:tcPr>
+            <w:tcW w:w="2337" w:type="dxa"/>
+          </w:tcPr>
+          <w:p>
+            <w:pPr>
+              <w:jc w:val="both"/>
+              <w:rPr>
+                <w:lang w:val="es-ES"/>
+              </w:rPr>
+            </w:pPr>
+            <w:r>
+              <w:rPr>
+                <w:lang w:val="es-ES"/>
+              </w:rPr>
+              <w:t>0.86</w:t>
+            </w:r>
+          </w:p>
+        </w:tc>
+        <w:tc>
+          <w:tcPr>
+            <w:tcW w:w="2338" w:type="dxa"/>
+          </w:tcPr>
+          <w:p>
+            <w:pPr>
+              <w:jc w:val="both"/>
+              <w:rPr>
+                <w:lang w:val="es-ES"/>
+              </w:rPr>
+            </w:pPr>
+            <w:r>
+              <w:rPr>
+                <w:lang w:val="es-ES"/>
+              </w:rPr>
+              <w:t>0.78</w:t>
+            </w:r>
+          </w:p>
+        </w:tc>
+        <w:tc>
+          <w:tcPr>
+            <w:tcW w:w="2338" w:type="dxa"/>
+          </w:tcPr>
+          <w:p>
+            <w:pPr>
+              <w:jc w:val="both"/>
+              <w:rPr>
+                <w:lang w:val="es-ES"/>
+              </w:rPr>
+            </w:pPr>
+            <w:r>
+              <w:rPr>
+                <w:lang w:val="es-ES"/>
+              </w:rPr>
+              <w:t>0.91</w:t>
+            </w:r>
+          </w:p>
+        </w:tc>
+      </w:tr>
+      <w:tr>
+        <w:tc>
+          <w:tcPr>
+            <w:tcW w:w="2337" w:type="dxa"/>
+          </w:tcPr>
+          <w:p>
+            <w:pPr>
+              <w:jc w:val="both"/>
+              <w:rPr>
+                <w:lang w:val="es-ES"/>
+              </w:rPr>
+            </w:pPr>
+            <w:proofErr w:type="spellStart"/>
+            <w:r>
+              <w:rPr>
+                <w:lang w:val="es-ES"/>
+              </w:rPr>
+              <w:t>Random</w:t>
+            </w:r>
+            <w:proofErr w:type="spellEnd"/>
+            <w:r>
+              <w:rPr>
+                <w:lang w:val="es-ES"/>
+              </w:rPr>
+              <w:t xml:space="preserve"> </w:t>
+            </w:r>
+            <w:proofErr w:type="spellStart"/>
+            <w:r>
+              <w:rPr>
+                <w:lang w:val="es-ES"/>
+              </w:rPr>
+              <w:t>Forest</w:t>
+            </w:r>
+            <w:proofErr w:type="spellEnd"/>
+          </w:p>
+        </w:tc>
+        <w:tc>
+          <w:tcPr>
+            <w:tcW w:w="2337" w:type="dxa"/>
+          </w:tcPr>
+          <w:p>
+            <w:pPr>
+              <w:jc w:val="both"/>
+              <w:rPr>
+                <w:lang w:val="es-ES"/>
+              </w:rPr>
+            </w:pPr>
+            <w:r>
+              <w:rPr>
+                <w:lang w:val="es-ES"/>
+              </w:rPr>
+              <w:t>0.82</w:t>
+            </w:r>
+          </w:p>
+        </w:tc>
+        <w:tc>
+          <w:tcPr>
+            <w:tcW w:w="2338" w:type="dxa"/>
+          </w:tcPr>
+          <w:p>
+            <w:pPr>
+              <w:jc w:val="both"/>
+              <w:rPr>
+                <w:lang w:val="es-ES"/>
+              </w:rPr>
+            </w:pPr>
+            <w:r>
+              <w:rPr>
+                <w:lang w:val="es-ES"/>
+              </w:rPr>
+              <w:t>0.68</w:t>
+            </w:r>
+          </w:p>
+        </w:tc>
+        <w:tc>
+          <w:tcPr>
+            <w:tcW w:w="2338" w:type="dxa"/>
+          </w:tcPr>
+          <w:p>
+            <w:pPr>
+              <w:jc w:val="both"/>
+              <w:rPr>
+                <w:lang w:val="es-ES"/>
+              </w:rPr>
+            </w:pPr>
+            <w:r>
+              <w:rPr>
+                <w:lang w:val="es-ES"/>
+              </w:rPr>
+              <w:t>0.90</w:t>
+            </w:r>
+          </w:p>
+        </w:tc>
+      </w:tr>
+    </w:tbl>
+    <w:p>
+      <w:pPr>
+        <w:jc w:val="both"/>
+        <w:rPr>
+          <w:lang w:val="es-ES"/>
+        </w:rPr>
+      </w:pPr>
+    </w:p>
+    <w:p>
+      <w:pPr>
+        <w:jc w:val="both"/>
+        <w:rPr>
+          <w:lang w:val="es-ES"/>
+        </w:rPr>
+      </w:pPr>
+      <w:r>
+        <w:rPr>
+          <w:lang w:val="es-ES"/>
+        </w:rPr>
+        <w:t xml:space="preserve">La Regresión Logística superó al </w:t>
+      </w:r>
+      <w:proofErr w:type="spellStart"/>
+      <w:r>
+        <w:rPr>
+          <w:lang w:val="es-ES"/>
+        </w:rPr>
+        <w:t>Random</w:t>
       </w:r>
       <w:proofErr w:type="spellEnd"/>
       <w:r>
+        <w:rPr>
+          <w:lang w:val="es-ES"/>
+        </w:rPr>
         <w:t xml:space="preserve"> </w:t>
       </w:r>
       <w:proofErr w:type="spellStart"/>
       <w:r>
-        <w:t>ejecutivo</w:t>
+        <w:rPr>
+          <w:lang w:val="es-ES"/>
+        </w:rPr>
+        <w:t>Forest</w:t>
       </w:r>
       <w:proofErr w:type="spellEnd"/>
       <w:r>
-        <w:t>:</w:t>
-      </w:r>
-    </w:p>
-    <w:p>
+        <w:rPr>
+          <w:lang w:val="es-ES"/>
+        </w:rPr>
+        <w:t xml:space="preserve"> tras el escalado de datos, logrando un </w:t>
+      </w:r>
+      <w:proofErr w:type="spellStart"/>
+      <w:r>
+        <w:rPr>
+          <w:lang w:val="es-ES"/>
+        </w:rPr>
+        <w:t>Recall</w:t>
+      </w:r>
+      <w:proofErr w:type="spellEnd"/>
+      <w:r>
+        <w:rPr>
+          <w:lang w:val="es-ES"/>
+        </w:rPr>
+        <w:t xml:space="preserve"> del 94% para la clase "</w:t>
+      </w:r>
+      <w:proofErr w:type="spellStart"/>
+      <w:r>
+        <w:rPr>
+          <w:lang w:val="es-ES"/>
+        </w:rPr>
+        <w:t>Subscribed</w:t>
+      </w:r>
+      <w:proofErr w:type="spellEnd"/>
+      <w:r>
+        <w:rPr>
+          <w:lang w:val="es-ES"/>
+        </w:rPr>
+        <w:t>". Esto significa que el negocio puede identificar a casi todos los suscriptores potenciales, con un margen de error controlado en la precisión.</w:t>
+      </w:r>
+    </w:p>
+    <w:p>
+      <w:pPr>
+        <w:jc w:val="both"/>
+        <w:rPr>
+          <w:lang w:val="es-ES"/>
+        </w:rPr>
+      </w:pPr>
+    </w:p>
+    <w:p>
+      <w:pPr>
+        <w:pStyle w:val="ListParagraph"/>
+        <w:numPr>
+          <w:ilvl w:val="0"/>
+          <w:numId w:val="3"/>
+        </w:numPr>
+        <w:ind w:left="426"/>
+        <w:jc w:val="both"/>
+        <w:rPr>
+          <w:lang w:val="es-ES"/>
+        </w:rPr>
+      </w:pPr>
+      <w:r>
+        <w:rPr>
+          <w:lang w:val="es-ES"/>
+        </w:rPr>
+        <w:t>Regresión (Monto de Compra)</w:t>
+      </w:r>
+    </w:p>
+    <w:p>
+      <w:pPr>
+        <w:jc w:val="both"/>
+        <w:rPr>
+          <w:lang w:val="es-ES"/>
+        </w:rPr>
+      </w:pPr>
+    </w:p>
+    <w:p>
+      <w:pPr>
+        <w:jc w:val="both"/>
+        <w:rPr>
+          <w:lang w:val="es-ES"/>
+        </w:rPr>
+      </w:pPr>
+      <w:r>
+        <w:rPr>
+          <w:lang w:val="es-ES"/>
+        </w:rPr>
+        <w:t>A pesar de la ingeniería de variables, el R</w:t>
+      </w:r>
+      <w:r>
+        <w:rPr>
+          <w:lang w:val="es-ES"/>
+        </w:rPr>
+        <w:t xml:space="preserve"> cuadrado </w:t>
+      </w:r>
+      <w:r>
+        <w:rPr>
+          <w:lang w:val="es-ES"/>
+        </w:rPr>
+        <w:t>se mantuvo cercano a 0 (-0.008).</w:t>
+      </w:r>
+    </w:p>
+    <w:p>
+      <w:pPr>
+        <w:jc w:val="both"/>
+        <w:rPr>
+          <w:lang w:val="es-ES"/>
+        </w:rPr>
+      </w:pPr>
+    </w:p>
+    <w:p>
+      <w:pPr>
+        <w:jc w:val="both"/>
+        <w:rPr>
+          <w:lang w:val="es-ES"/>
+        </w:rPr>
+      </w:pPr>
+      <w:r>
+        <w:rPr>
+          <w:lang w:val="es-ES"/>
+        </w:rPr>
+        <w:t xml:space="preserve">Interpretación: El </w:t>
+      </w:r>
+      <w:proofErr w:type="spellStart"/>
+      <w:r>
+        <w:rPr>
+          <w:lang w:val="es-ES"/>
+        </w:rPr>
+        <w:t>Purchase</w:t>
+      </w:r>
+      <w:proofErr w:type="spellEnd"/>
+      <w:r>
+        <w:rPr>
+          <w:lang w:val="es-ES"/>
+        </w:rPr>
+        <w:t xml:space="preserve"> </w:t>
+      </w:r>
+      <w:proofErr w:type="spellStart"/>
+      <w:r>
+        <w:rPr>
+          <w:lang w:val="es-ES"/>
+        </w:rPr>
+        <w:t>Amount</w:t>
+      </w:r>
+      <w:proofErr w:type="spellEnd"/>
+      <w:r>
+        <w:rPr>
+          <w:lang w:val="es-ES"/>
+        </w:rPr>
+        <w:t xml:space="preserve"> en este </w:t>
+      </w:r>
+      <w:proofErr w:type="spellStart"/>
+      <w:r>
+        <w:rPr>
+          <w:lang w:val="es-ES"/>
+        </w:rPr>
+        <w:t>dataset</w:t>
+      </w:r>
+      <w:proofErr w:type="spellEnd"/>
+      <w:r>
+        <w:rPr>
+          <w:lang w:val="es-ES"/>
+        </w:rPr>
+        <w:t xml:space="preserve"> no sigue un patrón demográfico o conductual. Los clientes gastan montos similares independientemente de su edad, género o ubicación. </w:t>
+      </w:r>
+      <w:r>
+        <w:rPr>
+          <w:lang w:val="es-ES"/>
+        </w:rPr>
+        <w:t>N</w:t>
+      </w:r>
+      <w:r>
+        <w:rPr>
+          <w:lang w:val="es-ES"/>
+        </w:rPr>
+        <w:t>o hay señal suficiente para predecir esta variable.</w:t>
+      </w:r>
+    </w:p>
+    <w:p>
+      <w:pPr>
+        <w:jc w:val="both"/>
+        <w:rPr>
+          <w:lang w:val="es-ES"/>
+        </w:rPr>
+      </w:pPr>
+    </w:p>
+    <w:p>
+      <w:pPr>
+        <w:jc w:val="both"/>
+        <w:rPr>
+          <w:b/>
+          <w:bCs/>
+          <w:lang w:val="es-ES"/>
+        </w:rPr>
+      </w:pPr>
+      <w:r>
+        <w:rPr>
+          <w:b/>
+          <w:bCs/>
+          <w:lang w:val="es-ES"/>
+        </w:rPr>
+        <w:t>Conclusiones y Recomendaciones</w:t>
+      </w:r>
+    </w:p>
+    <w:p>
+      <w:pPr>
+        <w:jc w:val="both"/>
+        <w:rPr>
+          <w:b/>
+          <w:bCs/>
+          <w:lang w:val="es-ES"/>
+        </w:rPr>
+      </w:pPr>
+    </w:p>
+    <w:p>
+      <w:pPr>
+        <w:pStyle w:val="ListParagraph"/>
+        <w:numPr>
+          <w:ilvl w:val="0"/>
+          <w:numId w:val="5"/>
+        </w:numPr>
+        <w:jc w:val="both"/>
+        <w:rPr>
+          <w:lang w:val="es-ES"/>
+        </w:rPr>
+      </w:pPr>
+      <w:r>
+        <w:rPr>
+          <w:lang w:val="es-ES"/>
+        </w:rPr>
+        <w:t>Perfil del Suscriptor: El éxito de la suscripción está directamente ligado a la disponibilidad de descuentos y al género del cliente (segmento masculino predominante en suscripciones en esta muestra).</w:t>
+      </w:r>
+    </w:p>
+    <w:p>
+      <w:pPr>
+        <w:jc w:val="both"/>
+        <w:rPr>
+          <w:lang w:val="es-ES"/>
+        </w:rPr>
+      </w:pPr>
+    </w:p>
+    <w:p>
+      <w:pPr>
+        <w:pStyle w:val="ListParagraph"/>
+        <w:numPr>
+          <w:ilvl w:val="0"/>
+          <w:numId w:val="5"/>
+        </w:numPr>
+        <w:jc w:val="both"/>
+        <w:rPr>
+          <w:lang w:val="es-ES"/>
+        </w:rPr>
+      </w:pPr>
+      <w:r>
+        <w:rPr>
+          <w:lang w:val="es-ES"/>
+        </w:rPr>
+        <w:t xml:space="preserve">Valor de </w:t>
+      </w:r>
+      <w:proofErr w:type="spellStart"/>
+      <w:r>
+        <w:rPr>
+          <w:lang w:val="es-ES"/>
+        </w:rPr>
+        <w:t>MLflow</w:t>
+      </w:r>
+      <w:proofErr w:type="spellEnd"/>
+      <w:r>
+        <w:rPr>
+          <w:lang w:val="es-ES"/>
+        </w:rPr>
+        <w:t xml:space="preserve">: La trazabilidad de experimentos permitió identificar rápidamente qué transformaciones de datos movían </w:t>
+      </w:r>
+      <w:r>
+        <w:rPr>
+          <w:lang w:val="es-ES"/>
+        </w:rPr>
+        <w:t>los valores</w:t>
+      </w:r>
+      <w:r>
+        <w:rPr>
+          <w:lang w:val="es-ES"/>
+        </w:rPr>
+        <w:t xml:space="preserve"> del F1-Score.</w:t>
+      </w:r>
+    </w:p>
+    <w:p>
+      <w:pPr>
+        <w:jc w:val="both"/>
+        <w:rPr>
+          <w:lang w:val="es-ES"/>
+        </w:rPr>
+      </w:pPr>
+    </w:p>
+    <w:p>
+      <w:pPr>
+        <w:pStyle w:val="ListParagraph"/>
+        <w:numPr>
+          <w:ilvl w:val="0"/>
+          <w:numId w:val="5"/>
+        </w:numPr>
+        <w:jc w:val="both"/>
+        <w:rPr>
+          <w:lang w:val="es-ES"/>
+        </w:rPr>
+      </w:pPr>
+      <w:r>
+        <w:rPr>
+          <w:lang w:val="es-ES"/>
+        </w:rPr>
+        <w:t xml:space="preserve">Próximos Pasos: Para mejorar la regresión, se recomendaría capturar datos sobre el historial de navegación o </w:t>
+      </w:r>
+      <w:proofErr w:type="spellStart"/>
+      <w:r>
+        <w:rPr>
+          <w:lang w:val="es-ES"/>
+        </w:rPr>
+        <w:t>clic</w:t>
+      </w:r>
+      <w:r>
+        <w:rPr>
+          <w:lang w:val="es-ES"/>
+        </w:rPr>
+        <w:t>k</w:t>
+      </w:r>
+      <w:r>
+        <w:rPr>
+          <w:lang w:val="es-ES"/>
+        </w:rPr>
+        <w:t>s</w:t>
+      </w:r>
+      <w:proofErr w:type="spellEnd"/>
+      <w:r>
+        <w:rPr>
+          <w:lang w:val="es-ES"/>
+        </w:rPr>
+        <w:t>, ya que el perfil</w:t>
+      </w:r>
+      <w:r>
+        <w:rPr>
+          <w:lang w:val="es-ES"/>
+        </w:rPr>
+        <w:t xml:space="preserve"> </w:t>
+      </w:r>
+      <w:r>
+        <w:rPr>
+          <w:lang w:val="es-ES"/>
+        </w:rPr>
+        <w:t>actual no es suficiente para predecir el ticket de venta.</w:t>
+      </w:r>
+    </w:p>
+    <w:p>
+      <w:pPr>
+        <w:pStyle w:val="ListParagraph"/>
+        <w:rPr>
+          <w:lang w:val="es-ES"/>
+        </w:rPr>
+      </w:pPr>
+    </w:p>
+    <w:p>
+      <w:pPr>
+        <w:jc w:val="both"/>
+        <w:rPr>
+          <w:lang w:val="es-ES"/>
+        </w:rPr>
+      </w:pPr>
       <w:bookmarkStart w:id="0" w:name="_GoBack"/>
       <w:bookmarkEnd w:id="0"/>
     </w:p>
@@ -462,6 +2072,522 @@
     </w:sectPr>
   </w:body>
 </w:document>
+</file>
+
+<file path=word/numbering.xml><?xml version="1.0" encoding="utf-8"?>
+<w:numbering xmlns:wpc="http://schemas.microsoft.com/office/word/2010/wordprocessingCanvas" xmlns:cx="http://schemas.microsoft.com/office/drawing/2014/chartex" xmlns:cx1="http://schemas.microsoft.com/office/drawing/2015/9/8/chartex" xmlns:cx2="http://schemas.microsoft.com/office/drawing/2015/10/21/chartex" xmlns:cx3="http://schemas.microsoft.com/office/drawing/2016/5/9/chartex" xmlns:cx4="http://schemas.microsoft.com/office/drawing/2016/5/10/chartex" xmlns:cx5="http://schemas.microsoft.com/office/drawing/2016/5/11/chartex" xmlns:cx6="http://schemas.microsoft.com/office/drawing/2016/5/12/chartex" xmlns:cx7="http://schemas.microsoft.com/office/drawing/2016/5/13/chartex" xmlns:cx8="http://schemas.microsoft.com/office/drawing/2016/5/14/chartex" xmlns:mc="http://schemas.openxmlformats.org/markup-compatibility/2006" xmlns:aink="http://schemas.microsoft.com/office/drawing/2016/ink" xmlns:am3d="http://schemas.microsoft.com/office/drawing/2017/model3d" xmlns:o="urn:schemas-microsoft-com:office:office" xmlns:r="http://schemas.openxmlformats.org/officeDocument/2006/relationships" xmlns:m="http://schemas.openxmlformats.org/officeDocument/2006/math" xmlns:v="urn:schemas-microsoft-com:vml" xmlns:wp14="http://schemas.microsoft.com/office/word/2010/wordprocessingDrawing" xmlns:wp="http://schemas.openxmlformats.org/drawingml/2006/wordprocessingDrawing" xmlns:w10="urn:schemas-microsoft-com:office:word" xmlns:w="http://schemas.openxmlformats.org/wordprocessingml/2006/main" xmlns:w14="http://schemas.microsoft.com/office/word/2010/wordml" xmlns:w15="http://schemas.microsoft.com/office/word/2012/wordml" xmlns:w16cex="http://schemas.microsoft.com/office/word/2018/wordml/cex" xmlns:w16cid="http://schemas.microsoft.com/office/word/2016/wordml/cid" xmlns:w16="http://schemas.microsoft.com/office/word/2018/wordml" xmlns:w16se="http://schemas.microsoft.com/office/word/2015/wordml/symex" xmlns:wpg="http://schemas.microsoft.com/office/word/2010/wordprocessingGroup" xmlns:wpi="http://schemas.microsoft.com/office/word/2010/wordprocessingInk" xmlns:wne="http://schemas.microsoft.com/office/word/2006/wordml" xmlns:wps="http://schemas.microsoft.com/office/word/2010/wordprocessingShape" mc:Ignorable="w14 w15 w16se w16cid w16 w16cex wp14">
+  <w:abstractNum w:abstractNumId="0" w15:restartNumberingAfterBreak="0">
+    <w:nsid w:val="0D5102FF"/>
+    <w:multiLevelType w:val="hybridMultilevel"/>
+    <w:tmpl w:val="5D98223A"/>
+    <w:lvl w:ilvl="0" w:tplc="0409000F">
+      <w:start w:val="1"/>
+      <w:numFmt w:val="decimal"/>
+      <w:lvlText w:val="%1."/>
+      <w:lvlJc w:val="left"/>
+      <w:pPr>
+        <w:ind w:left="720" w:hanging="360"/>
+      </w:pPr>
+    </w:lvl>
+    <w:lvl w:ilvl="1" w:tplc="04090019" w:tentative="1">
+      <w:start w:val="1"/>
+      <w:numFmt w:val="lowerLetter"/>
+      <w:lvlText w:val="%2."/>
+      <w:lvlJc w:val="left"/>
+      <w:pPr>
+        <w:ind w:left="1440" w:hanging="360"/>
+      </w:pPr>
+    </w:lvl>
+    <w:lvl w:ilvl="2" w:tplc="0409001B" w:tentative="1">
+      <w:start w:val="1"/>
+      <w:numFmt w:val="lowerRoman"/>
+      <w:lvlText w:val="%3."/>
+      <w:lvlJc w:val="right"/>
+      <w:pPr>
+        <w:ind w:left="2160" w:hanging="180"/>
+      </w:pPr>
+    </w:lvl>
+    <w:lvl w:ilvl="3" w:tplc="0409000F" w:tentative="1">
+      <w:start w:val="1"/>
+      <w:numFmt w:val="decimal"/>
+      <w:lvlText w:val="%4."/>
+      <w:lvlJc w:val="left"/>
+      <w:pPr>
+        <w:ind w:left="2880" w:hanging="360"/>
+      </w:pPr>
+    </w:lvl>
+    <w:lvl w:ilvl="4" w:tplc="04090019" w:tentative="1">
+      <w:start w:val="1"/>
+      <w:numFmt w:val="lowerLetter"/>
+      <w:lvlText w:val="%5."/>
+      <w:lvlJc w:val="left"/>
+      <w:pPr>
+        <w:ind w:left="3600" w:hanging="360"/>
+      </w:pPr>
+    </w:lvl>
+    <w:lvl w:ilvl="5" w:tplc="0409001B" w:tentative="1">
+      <w:start w:val="1"/>
+      <w:numFmt w:val="lowerRoman"/>
+      <w:lvlText w:val="%6."/>
+      <w:lvlJc w:val="right"/>
+      <w:pPr>
+        <w:ind w:left="4320" w:hanging="180"/>
+      </w:pPr>
+    </w:lvl>
+    <w:lvl w:ilvl="6" w:tplc="0409000F" w:tentative="1">
+      <w:start w:val="1"/>
+      <w:numFmt w:val="decimal"/>
+      <w:lvlText w:val="%7."/>
+      <w:lvlJc w:val="left"/>
+      <w:pPr>
+        <w:ind w:left="5040" w:hanging="360"/>
+      </w:pPr>
+    </w:lvl>
+    <w:lvl w:ilvl="7" w:tplc="04090019" w:tentative="1">
+      <w:start w:val="1"/>
+      <w:numFmt w:val="lowerLetter"/>
+      <w:lvlText w:val="%8."/>
+      <w:lvlJc w:val="left"/>
+      <w:pPr>
+        <w:ind w:left="5760" w:hanging="360"/>
+      </w:pPr>
+    </w:lvl>
+    <w:lvl w:ilvl="8" w:tplc="0409001B" w:tentative="1">
+      <w:start w:val="1"/>
+      <w:numFmt w:val="lowerRoman"/>
+      <w:lvlText w:val="%9."/>
+      <w:lvlJc w:val="right"/>
+      <w:pPr>
+        <w:ind w:left="6480" w:hanging="180"/>
+      </w:pPr>
+    </w:lvl>
+  </w:abstractNum>
+  <w:abstractNum w:abstractNumId="1" w15:restartNumberingAfterBreak="0">
+    <w:nsid w:val="1C4B18C7"/>
+    <w:multiLevelType w:val="hybridMultilevel"/>
+    <w:tmpl w:val="63AE5F8C"/>
+    <w:lvl w:ilvl="0" w:tplc="0409000F">
+      <w:start w:val="1"/>
+      <w:numFmt w:val="decimal"/>
+      <w:lvlText w:val="%1."/>
+      <w:lvlJc w:val="left"/>
+      <w:pPr>
+        <w:ind w:left="720" w:hanging="360"/>
+      </w:pPr>
+    </w:lvl>
+    <w:lvl w:ilvl="1" w:tplc="04090019" w:tentative="1">
+      <w:start w:val="1"/>
+      <w:numFmt w:val="lowerLetter"/>
+      <w:lvlText w:val="%2."/>
+      <w:lvlJc w:val="left"/>
+      <w:pPr>
+        <w:ind w:left="1440" w:hanging="360"/>
+      </w:pPr>
+    </w:lvl>
+    <w:lvl w:ilvl="2" w:tplc="0409001B" w:tentative="1">
+      <w:start w:val="1"/>
+      <w:numFmt w:val="lowerRoman"/>
+      <w:lvlText w:val="%3."/>
+      <w:lvlJc w:val="right"/>
+      <w:pPr>
+        <w:ind w:left="2160" w:hanging="180"/>
+      </w:pPr>
+    </w:lvl>
+    <w:lvl w:ilvl="3" w:tplc="0409000F" w:tentative="1">
+      <w:start w:val="1"/>
+      <w:numFmt w:val="decimal"/>
+      <w:lvlText w:val="%4."/>
+      <w:lvlJc w:val="left"/>
+      <w:pPr>
+        <w:ind w:left="2880" w:hanging="360"/>
+      </w:pPr>
+    </w:lvl>
+    <w:lvl w:ilvl="4" w:tplc="04090019" w:tentative="1">
+      <w:start w:val="1"/>
+      <w:numFmt w:val="lowerLetter"/>
+      <w:lvlText w:val="%5."/>
+      <w:lvlJc w:val="left"/>
+      <w:pPr>
+        <w:ind w:left="3600" w:hanging="360"/>
+      </w:pPr>
+    </w:lvl>
+    <w:lvl w:ilvl="5" w:tplc="0409001B" w:tentative="1">
+      <w:start w:val="1"/>
+      <w:numFmt w:val="lowerRoman"/>
+      <w:lvlText w:val="%6."/>
+      <w:lvlJc w:val="right"/>
+      <w:pPr>
+        <w:ind w:left="4320" w:hanging="180"/>
+      </w:pPr>
+    </w:lvl>
+    <w:lvl w:ilvl="6" w:tplc="0409000F" w:tentative="1">
+      <w:start w:val="1"/>
+      <w:numFmt w:val="decimal"/>
+      <w:lvlText w:val="%7."/>
+      <w:lvlJc w:val="left"/>
+      <w:pPr>
+        <w:ind w:left="5040" w:hanging="360"/>
+      </w:pPr>
+    </w:lvl>
+    <w:lvl w:ilvl="7" w:tplc="04090019" w:tentative="1">
+      <w:start w:val="1"/>
+      <w:numFmt w:val="lowerLetter"/>
+      <w:lvlText w:val="%8."/>
+      <w:lvlJc w:val="left"/>
+      <w:pPr>
+        <w:ind w:left="5760" w:hanging="360"/>
+      </w:pPr>
+    </w:lvl>
+    <w:lvl w:ilvl="8" w:tplc="0409001B" w:tentative="1">
+      <w:start w:val="1"/>
+      <w:numFmt w:val="lowerRoman"/>
+      <w:lvlText w:val="%9."/>
+      <w:lvlJc w:val="right"/>
+      <w:pPr>
+        <w:ind w:left="6480" w:hanging="180"/>
+      </w:pPr>
+    </w:lvl>
+  </w:abstractNum>
+  <w:abstractNum w:abstractNumId="2" w15:restartNumberingAfterBreak="0">
+    <w:nsid w:val="289A4A28"/>
+    <w:multiLevelType w:val="hybridMultilevel"/>
+    <w:tmpl w:val="F0B866F0"/>
+    <w:lvl w:ilvl="0" w:tplc="04090015">
+      <w:start w:val="1"/>
+      <w:numFmt w:val="upperLetter"/>
+      <w:lvlText w:val="%1."/>
+      <w:lvlJc w:val="left"/>
+      <w:pPr>
+        <w:ind w:left="720" w:hanging="360"/>
+      </w:pPr>
+      <w:rPr>
+        <w:rFonts w:hint="default"/>
+      </w:rPr>
+    </w:lvl>
+    <w:lvl w:ilvl="1" w:tplc="04090019" w:tentative="1">
+      <w:start w:val="1"/>
+      <w:numFmt w:val="lowerLetter"/>
+      <w:lvlText w:val="%2."/>
+      <w:lvlJc w:val="left"/>
+      <w:pPr>
+        <w:ind w:left="1440" w:hanging="360"/>
+      </w:pPr>
+    </w:lvl>
+    <w:lvl w:ilvl="2" w:tplc="0409001B" w:tentative="1">
+      <w:start w:val="1"/>
+      <w:numFmt w:val="lowerRoman"/>
+      <w:lvlText w:val="%3."/>
+      <w:lvlJc w:val="right"/>
+      <w:pPr>
+        <w:ind w:left="2160" w:hanging="180"/>
+      </w:pPr>
+    </w:lvl>
+    <w:lvl w:ilvl="3" w:tplc="0409000F" w:tentative="1">
+      <w:start w:val="1"/>
+      <w:numFmt w:val="decimal"/>
+      <w:lvlText w:val="%4."/>
+      <w:lvlJc w:val="left"/>
+      <w:pPr>
+        <w:ind w:left="2880" w:hanging="360"/>
+      </w:pPr>
+    </w:lvl>
+    <w:lvl w:ilvl="4" w:tplc="04090019" w:tentative="1">
+      <w:start w:val="1"/>
+      <w:numFmt w:val="lowerLetter"/>
+      <w:lvlText w:val="%5."/>
+      <w:lvlJc w:val="left"/>
+      <w:pPr>
+        <w:ind w:left="3600" w:hanging="360"/>
+      </w:pPr>
+    </w:lvl>
+    <w:lvl w:ilvl="5" w:tplc="0409001B" w:tentative="1">
+      <w:start w:val="1"/>
+      <w:numFmt w:val="lowerRoman"/>
+      <w:lvlText w:val="%6."/>
+      <w:lvlJc w:val="right"/>
+      <w:pPr>
+        <w:ind w:left="4320" w:hanging="180"/>
+      </w:pPr>
+    </w:lvl>
+    <w:lvl w:ilvl="6" w:tplc="0409000F" w:tentative="1">
+      <w:start w:val="1"/>
+      <w:numFmt w:val="decimal"/>
+      <w:lvlText w:val="%7."/>
+      <w:lvlJc w:val="left"/>
+      <w:pPr>
+        <w:ind w:left="5040" w:hanging="360"/>
+      </w:pPr>
+    </w:lvl>
+    <w:lvl w:ilvl="7" w:tplc="04090019" w:tentative="1">
+      <w:start w:val="1"/>
+      <w:numFmt w:val="lowerLetter"/>
+      <w:lvlText w:val="%8."/>
+      <w:lvlJc w:val="left"/>
+      <w:pPr>
+        <w:ind w:left="5760" w:hanging="360"/>
+      </w:pPr>
+    </w:lvl>
+    <w:lvl w:ilvl="8" w:tplc="0409001B" w:tentative="1">
+      <w:start w:val="1"/>
+      <w:numFmt w:val="lowerRoman"/>
+      <w:lvlText w:val="%9."/>
+      <w:lvlJc w:val="right"/>
+      <w:pPr>
+        <w:ind w:left="6480" w:hanging="180"/>
+      </w:pPr>
+    </w:lvl>
+  </w:abstractNum>
+  <w:abstractNum w:abstractNumId="3" w15:restartNumberingAfterBreak="0">
+    <w:nsid w:val="3464296B"/>
+    <w:multiLevelType w:val="multilevel"/>
+    <w:tmpl w:val="4A3A03C2"/>
+    <w:lvl w:ilvl="0">
+      <w:start w:val="1"/>
+      <w:numFmt w:val="bullet"/>
+      <w:lvlText w:val=""/>
+      <w:lvlJc w:val="left"/>
+      <w:pPr>
+        <w:tabs>
+          <w:tab w:val="num" w:pos="720"/>
+        </w:tabs>
+        <w:ind w:left="720" w:hanging="360"/>
+      </w:pPr>
+      <w:rPr>
+        <w:rFonts w:ascii="Symbol" w:hAnsi="Symbol" w:hint="default"/>
+        <w:sz w:val="20"/>
+      </w:rPr>
+    </w:lvl>
+    <w:lvl w:ilvl="1" w:tentative="1">
+      <w:start w:val="1"/>
+      <w:numFmt w:val="bullet"/>
+      <w:lvlText w:val="o"/>
+      <w:lvlJc w:val="left"/>
+      <w:pPr>
+        <w:tabs>
+          <w:tab w:val="num" w:pos="1440"/>
+        </w:tabs>
+        <w:ind w:left="1440" w:hanging="360"/>
+      </w:pPr>
+      <w:rPr>
+        <w:rFonts w:ascii="Courier New" w:hAnsi="Courier New" w:hint="default"/>
+        <w:sz w:val="20"/>
+      </w:rPr>
+    </w:lvl>
+    <w:lvl w:ilvl="2" w:tentative="1">
+      <w:start w:val="1"/>
+      <w:numFmt w:val="bullet"/>
+      <w:lvlText w:val=""/>
+      <w:lvlJc w:val="left"/>
+      <w:pPr>
+        <w:tabs>
+          <w:tab w:val="num" w:pos="2160"/>
+        </w:tabs>
+        <w:ind w:left="2160" w:hanging="360"/>
+      </w:pPr>
+      <w:rPr>
+        <w:rFonts w:ascii="Wingdings" w:hAnsi="Wingdings" w:hint="default"/>
+        <w:sz w:val="20"/>
+      </w:rPr>
+    </w:lvl>
+    <w:lvl w:ilvl="3" w:tentative="1">
+      <w:start w:val="1"/>
+      <w:numFmt w:val="bullet"/>
+      <w:lvlText w:val=""/>
+      <w:lvlJc w:val="left"/>
+      <w:pPr>
+        <w:tabs>
+          <w:tab w:val="num" w:pos="2880"/>
+        </w:tabs>
+        <w:ind w:left="2880" w:hanging="360"/>
+      </w:pPr>
+      <w:rPr>
+        <w:rFonts w:ascii="Wingdings" w:hAnsi="Wingdings" w:hint="default"/>
+        <w:sz w:val="20"/>
+      </w:rPr>
+    </w:lvl>
+    <w:lvl w:ilvl="4" w:tentative="1">
+      <w:start w:val="1"/>
+      <w:numFmt w:val="bullet"/>
+      <w:lvlText w:val=""/>
+      <w:lvlJc w:val="left"/>
+      <w:pPr>
+        <w:tabs>
+          <w:tab w:val="num" w:pos="3600"/>
+        </w:tabs>
+        <w:ind w:left="3600" w:hanging="360"/>
+      </w:pPr>
+      <w:rPr>
+        <w:rFonts w:ascii="Wingdings" w:hAnsi="Wingdings" w:hint="default"/>
+        <w:sz w:val="20"/>
+      </w:rPr>
+    </w:lvl>
+    <w:lvl w:ilvl="5" w:tentative="1">
+      <w:start w:val="1"/>
+      <w:numFmt w:val="bullet"/>
+      <w:lvlText w:val=""/>
+      <w:lvlJc w:val="left"/>
+      <w:pPr>
+        <w:tabs>
+          <w:tab w:val="num" w:pos="4320"/>
+        </w:tabs>
+        <w:ind w:left="4320" w:hanging="360"/>
+      </w:pPr>
+      <w:rPr>
+        <w:rFonts w:ascii="Wingdings" w:hAnsi="Wingdings" w:hint="default"/>
+        <w:sz w:val="20"/>
+      </w:rPr>
+    </w:lvl>
+    <w:lvl w:ilvl="6" w:tentative="1">
+      <w:start w:val="1"/>
+      <w:numFmt w:val="bullet"/>
+      <w:lvlText w:val=""/>
+      <w:lvlJc w:val="left"/>
+      <w:pPr>
+        <w:tabs>
+          <w:tab w:val="num" w:pos="5040"/>
+        </w:tabs>
+        <w:ind w:left="5040" w:hanging="360"/>
+      </w:pPr>
+      <w:rPr>
+        <w:rFonts w:ascii="Wingdings" w:hAnsi="Wingdings" w:hint="default"/>
+        <w:sz w:val="20"/>
+      </w:rPr>
+    </w:lvl>
+    <w:lvl w:ilvl="7" w:tentative="1">
+      <w:start w:val="1"/>
+      <w:numFmt w:val="bullet"/>
+      <w:lvlText w:val=""/>
+      <w:lvlJc w:val="left"/>
+      <w:pPr>
+        <w:tabs>
+          <w:tab w:val="num" w:pos="5760"/>
+        </w:tabs>
+        <w:ind w:left="5760" w:hanging="360"/>
+      </w:pPr>
+      <w:rPr>
+        <w:rFonts w:ascii="Wingdings" w:hAnsi="Wingdings" w:hint="default"/>
+        <w:sz w:val="20"/>
+      </w:rPr>
+    </w:lvl>
+    <w:lvl w:ilvl="8" w:tentative="1">
+      <w:start w:val="1"/>
+      <w:numFmt w:val="bullet"/>
+      <w:lvlText w:val=""/>
+      <w:lvlJc w:val="left"/>
+      <w:pPr>
+        <w:tabs>
+          <w:tab w:val="num" w:pos="6480"/>
+        </w:tabs>
+        <w:ind w:left="6480" w:hanging="360"/>
+      </w:pPr>
+      <w:rPr>
+        <w:rFonts w:ascii="Wingdings" w:hAnsi="Wingdings" w:hint="default"/>
+        <w:sz w:val="20"/>
+      </w:rPr>
+    </w:lvl>
+  </w:abstractNum>
+  <w:abstractNum w:abstractNumId="4" w15:restartNumberingAfterBreak="0">
+    <w:nsid w:val="5FC710FD"/>
+    <w:multiLevelType w:val="hybridMultilevel"/>
+    <w:tmpl w:val="BF6417FC"/>
+    <w:lvl w:ilvl="0" w:tplc="04090015">
+      <w:start w:val="1"/>
+      <w:numFmt w:val="upperLetter"/>
+      <w:lvlText w:val="%1."/>
+      <w:lvlJc w:val="left"/>
+      <w:pPr>
+        <w:ind w:left="720" w:hanging="360"/>
+      </w:pPr>
+    </w:lvl>
+    <w:lvl w:ilvl="1" w:tplc="04090019" w:tentative="1">
+      <w:start w:val="1"/>
+      <w:numFmt w:val="lowerLetter"/>
+      <w:lvlText w:val="%2."/>
+      <w:lvlJc w:val="left"/>
+      <w:pPr>
+        <w:ind w:left="1440" w:hanging="360"/>
+      </w:pPr>
+    </w:lvl>
+    <w:lvl w:ilvl="2" w:tplc="0409001B" w:tentative="1">
+      <w:start w:val="1"/>
+      <w:numFmt w:val="lowerRoman"/>
+      <w:lvlText w:val="%3."/>
+      <w:lvlJc w:val="right"/>
+      <w:pPr>
+        <w:ind w:left="2160" w:hanging="180"/>
+      </w:pPr>
+    </w:lvl>
+    <w:lvl w:ilvl="3" w:tplc="0409000F" w:tentative="1">
+      <w:start w:val="1"/>
+      <w:numFmt w:val="decimal"/>
+      <w:lvlText w:val="%4."/>
+      <w:lvlJc w:val="left"/>
+      <w:pPr>
+        <w:ind w:left="2880" w:hanging="360"/>
+      </w:pPr>
+    </w:lvl>
+    <w:lvl w:ilvl="4" w:tplc="04090019" w:tentative="1">
+      <w:start w:val="1"/>
+      <w:numFmt w:val="lowerLetter"/>
+      <w:lvlText w:val="%5."/>
+      <w:lvlJc w:val="left"/>
+      <w:pPr>
+        <w:ind w:left="3600" w:hanging="360"/>
+      </w:pPr>
+    </w:lvl>
+    <w:lvl w:ilvl="5" w:tplc="0409001B" w:tentative="1">
+      <w:start w:val="1"/>
+      <w:numFmt w:val="lowerRoman"/>
+      <w:lvlText w:val="%6."/>
+      <w:lvlJc w:val="right"/>
+      <w:pPr>
+        <w:ind w:left="4320" w:hanging="180"/>
+      </w:pPr>
+    </w:lvl>
+    <w:lvl w:ilvl="6" w:tplc="0409000F" w:tentative="1">
+      <w:start w:val="1"/>
+      <w:numFmt w:val="decimal"/>
+      <w:lvlText w:val="%7."/>
+      <w:lvlJc w:val="left"/>
+      <w:pPr>
+        <w:ind w:left="5040" w:hanging="360"/>
+      </w:pPr>
+    </w:lvl>
+    <w:lvl w:ilvl="7" w:tplc="04090019" w:tentative="1">
+      <w:start w:val="1"/>
+      <w:numFmt w:val="lowerLetter"/>
+      <w:lvlText w:val="%8."/>
+      <w:lvlJc w:val="left"/>
+      <w:pPr>
+        <w:ind w:left="5760" w:hanging="360"/>
+      </w:pPr>
+    </w:lvl>
+    <w:lvl w:ilvl="8" w:tplc="0409001B" w:tentative="1">
+      <w:start w:val="1"/>
+      <w:numFmt w:val="lowerRoman"/>
+      <w:lvlText w:val="%9."/>
+      <w:lvlJc w:val="right"/>
+      <w:pPr>
+        <w:ind w:left="6480" w:hanging="180"/>
+      </w:pPr>
+    </w:lvl>
+  </w:abstractNum>
+  <w:num w:numId="1">
+    <w:abstractNumId w:val="3"/>
+  </w:num>
+  <w:num w:numId="2">
+    <w:abstractNumId w:val="1"/>
+  </w:num>
+  <w:num w:numId="3">
+    <w:abstractNumId w:val="4"/>
+  </w:num>
+  <w:num w:numId="4">
+    <w:abstractNumId w:val="2"/>
+  </w:num>
+  <w:num w:numId="5">
+    <w:abstractNumId w:val="0"/>
+  </w:num>
+</w:numbering>
 </file>
 
 <file path=word/styles.xml><?xml version="1.0" encoding="utf-8"?>
@@ -885,6 +3011,33 @@
     <w:semiHidden/>
     <w:unhideWhenUsed/>
   </w:style>
+  <w:style w:type="paragraph" w:styleId="ListParagraph">
+    <w:name w:val="List Paragraph"/>
+    <w:basedOn w:val="Normal"/>
+    <w:uiPriority w:val="34"/>
+    <w:qFormat/>
+    <w:rsid w:val="00DC6B9B"/>
+    <w:pPr>
+      <w:ind w:left="720"/>
+      <w:contextualSpacing/>
+    </w:pPr>
+  </w:style>
+  <w:style w:type="table" w:styleId="TableGrid">
+    <w:name w:val="Table Grid"/>
+    <w:basedOn w:val="TableNormal"/>
+    <w:uiPriority w:val="39"/>
+    <w:rsid w:val="005F18B4"/>
+    <w:tblPr>
+      <w:tblBorders>
+        <w:top w:val="single" w:sz="4" w:space="0" w:color="auto"/>
+        <w:left w:val="single" w:sz="4" w:space="0" w:color="auto"/>
+        <w:bottom w:val="single" w:sz="4" w:space="0" w:color="auto"/>
+        <w:right w:val="single" w:sz="4" w:space="0" w:color="auto"/>
+        <w:insideH w:val="single" w:sz="4" w:space="0" w:color="auto"/>
+        <w:insideV w:val="single" w:sz="4" w:space="0" w:color="auto"/>
+      </w:tblBorders>
+    </w:tblPr>
+  </w:style>
 </w:styles>
 </file>
 

</xml_diff>